<commit_message>
Update PED v2.0 and requirement baselines
Refresh the Project Engineering Document to v2.0 and add the associated AI declaration and renamed risk-register PDF. Update the AI register to record the PED v2.0 consolidation work. Clarify the architecture-significant requirements in the ASR and baseline review documents, fix wording and editorial issues, and tighten the stakeholder-analysis scope, traceability, and acceptance criteria structure so the Milestone 2 requirements baseline is internally consistent.
</commit_message>
<xml_diff>
--- a/docs/Project Engineering Document v2.0.docx
+++ b/docs/Project Engineering Document v2.0.docx
@@ -1393,7 +1393,14 @@
     </w:p>
     <w:p>
       <w:r>
-        <w:t>Business Value - faster resolution of safety-critical issues, an auditable record for body corporate accountability and levy-funded maintenance decisions, reduced friction for residents, clearer workload visibility for maintenance and security staff.</w:t>
+        <w:rPr>
+          <w:b/>
+          <w:bCs/>
+        </w:rPr>
+        <w:t>Business Value</w:t>
+      </w:r>
+      <w:r>
+        <w:t xml:space="preserve"> - faster resolution of safety-critical issues, an auditable record for body corporate accountability and levy-funded maintenance decisions, reduced friction for residents, clearer workload visibility for maintenance and security staff.</w:t>
       </w:r>
     </w:p>
     <w:p>
@@ -2098,7 +2105,7 @@
       <w:tr>
         <w:tc>
           <w:tcPr>
-            <w:tcW w:w="1803" w:type="dxa"/>
+            <w:tcW w:w="819" w:type="dxa"/>
           </w:tcPr>
           <w:p>
             <w:pPr>
@@ -2118,7 +2125,7 @@
         </w:tc>
         <w:tc>
           <w:tcPr>
-            <w:tcW w:w="1803" w:type="dxa"/>
+            <w:tcW w:w="1747" w:type="dxa"/>
           </w:tcPr>
           <w:p>
             <w:pPr>
@@ -2138,7 +2145,7 @@
         </w:tc>
         <w:tc>
           <w:tcPr>
-            <w:tcW w:w="1803" w:type="dxa"/>
+            <w:tcW w:w="3615" w:type="dxa"/>
           </w:tcPr>
           <w:p>
             <w:pPr>
@@ -2158,7 +2165,7 @@
         </w:tc>
         <w:tc>
           <w:tcPr>
-            <w:tcW w:w="1803" w:type="dxa"/>
+            <w:tcW w:w="1716" w:type="dxa"/>
           </w:tcPr>
           <w:p>
             <w:pPr>
@@ -2178,7 +2185,7 @@
         </w:tc>
         <w:tc>
           <w:tcPr>
-            <w:tcW w:w="1804" w:type="dxa"/>
+            <w:tcW w:w="1119" w:type="dxa"/>
           </w:tcPr>
           <w:p>
             <w:pPr>
@@ -2200,7 +2207,7 @@
       <w:tr>
         <w:tc>
           <w:tcPr>
-            <w:tcW w:w="1803" w:type="dxa"/>
+            <w:tcW w:w="819" w:type="dxa"/>
           </w:tcPr>
           <w:p>
             <w:r>
@@ -2210,7 +2217,7 @@
         </w:tc>
         <w:tc>
           <w:tcPr>
-            <w:tcW w:w="1803" w:type="dxa"/>
+            <w:tcW w:w="1747" w:type="dxa"/>
           </w:tcPr>
           <w:p>
             <w:r>
@@ -2220,23 +2227,17 @@
         </w:tc>
         <w:tc>
           <w:tcPr>
-            <w:tcW w:w="1803" w:type="dxa"/>
-          </w:tcPr>
-          <w:p>
-            <w:r>
-              <w:t>Resident shall submit a request with category (</w:t>
-            </w:r>
-            <w:r>
-              <w:t>Maintenance</w:t>
-            </w:r>
-            <w:r>
-              <w:t>/Security/Common Area/Lost Property), description, and unit/location</w:t>
-            </w:r>
-          </w:p>
-        </w:tc>
-        <w:tc>
-          <w:tcPr>
-            <w:tcW w:w="1803" w:type="dxa"/>
+            <w:tcW w:w="3615" w:type="dxa"/>
+          </w:tcPr>
+          <w:p>
+            <w:r>
+              <w:t>Resident shall submit a request with category (Maintenance/Security/Common Area/Lost Property), description, and unit/location</w:t>
+            </w:r>
+          </w:p>
+        </w:tc>
+        <w:tc>
+          <w:tcPr>
+            <w:tcW w:w="1716" w:type="dxa"/>
           </w:tcPr>
           <w:p>
             <w:r>
@@ -2246,7 +2247,7 @@
         </w:tc>
         <w:tc>
           <w:tcPr>
-            <w:tcW w:w="1804" w:type="dxa"/>
+            <w:tcW w:w="1119" w:type="dxa"/>
           </w:tcPr>
           <w:p>
             <w:r>
@@ -2258,7 +2259,7 @@
       <w:tr>
         <w:tc>
           <w:tcPr>
-            <w:tcW w:w="1803" w:type="dxa"/>
+            <w:tcW w:w="819" w:type="dxa"/>
           </w:tcPr>
           <w:p>
             <w:r>
@@ -2269,7 +2270,7 @@
         </w:tc>
         <w:tc>
           <w:tcPr>
-            <w:tcW w:w="1803" w:type="dxa"/>
+            <w:tcW w:w="1747" w:type="dxa"/>
           </w:tcPr>
           <w:p>
             <w:r>
@@ -2279,7 +2280,7 @@
         </w:tc>
         <w:tc>
           <w:tcPr>
-            <w:tcW w:w="1803" w:type="dxa"/>
+            <w:tcW w:w="3615" w:type="dxa"/>
           </w:tcPr>
           <w:p>
             <w:r>
@@ -2289,7 +2290,7 @@
         </w:tc>
         <w:tc>
           <w:tcPr>
-            <w:tcW w:w="1803" w:type="dxa"/>
+            <w:tcW w:w="1716" w:type="dxa"/>
           </w:tcPr>
           <w:p>
             <w:r>
@@ -2299,7 +2300,7 @@
         </w:tc>
         <w:tc>
           <w:tcPr>
-            <w:tcW w:w="1804" w:type="dxa"/>
+            <w:tcW w:w="1119" w:type="dxa"/>
           </w:tcPr>
           <w:p>
             <w:r>
@@ -2311,7 +2312,7 @@
       <w:tr>
         <w:tc>
           <w:tcPr>
-            <w:tcW w:w="1803" w:type="dxa"/>
+            <w:tcW w:w="819" w:type="dxa"/>
           </w:tcPr>
           <w:p>
             <w:r>
@@ -2321,7 +2322,7 @@
         </w:tc>
         <w:tc>
           <w:tcPr>
-            <w:tcW w:w="1803" w:type="dxa"/>
+            <w:tcW w:w="1747" w:type="dxa"/>
           </w:tcPr>
           <w:p>
             <w:r>
@@ -2331,7 +2332,7 @@
         </w:tc>
         <w:tc>
           <w:tcPr>
-            <w:tcW w:w="1803" w:type="dxa"/>
+            <w:tcW w:w="3615" w:type="dxa"/>
           </w:tcPr>
           <w:p>
             <w:r>
@@ -2341,7 +2342,7 @@
         </w:tc>
         <w:tc>
           <w:tcPr>
-            <w:tcW w:w="1803" w:type="dxa"/>
+            <w:tcW w:w="1716" w:type="dxa"/>
           </w:tcPr>
           <w:p>
             <w:r>
@@ -2351,7 +2352,7 @@
         </w:tc>
         <w:tc>
           <w:tcPr>
-            <w:tcW w:w="1804" w:type="dxa"/>
+            <w:tcW w:w="1119" w:type="dxa"/>
           </w:tcPr>
           <w:p>
             <w:r>
@@ -2363,7 +2364,7 @@
       <w:tr>
         <w:tc>
           <w:tcPr>
-            <w:tcW w:w="1803" w:type="dxa"/>
+            <w:tcW w:w="819" w:type="dxa"/>
           </w:tcPr>
           <w:p>
             <w:r>
@@ -2373,7 +2374,7 @@
         </w:tc>
         <w:tc>
           <w:tcPr>
-            <w:tcW w:w="1803" w:type="dxa"/>
+            <w:tcW w:w="1747" w:type="dxa"/>
           </w:tcPr>
           <w:p>
             <w:r>
@@ -2383,7 +2384,7 @@
         </w:tc>
         <w:tc>
           <w:tcPr>
-            <w:tcW w:w="1803" w:type="dxa"/>
+            <w:tcW w:w="3615" w:type="dxa"/>
           </w:tcPr>
           <w:p>
             <w:r>
@@ -2393,7 +2394,7 @@
         </w:tc>
         <w:tc>
           <w:tcPr>
-            <w:tcW w:w="1803" w:type="dxa"/>
+            <w:tcW w:w="1716" w:type="dxa"/>
           </w:tcPr>
           <w:p>
             <w:r>
@@ -2403,7 +2404,7 @@
         </w:tc>
         <w:tc>
           <w:tcPr>
-            <w:tcW w:w="1804" w:type="dxa"/>
+            <w:tcW w:w="1119" w:type="dxa"/>
           </w:tcPr>
           <w:p>
             <w:r>
@@ -2415,7 +2416,7 @@
       <w:tr>
         <w:tc>
           <w:tcPr>
-            <w:tcW w:w="1803" w:type="dxa"/>
+            <w:tcW w:w="819" w:type="dxa"/>
           </w:tcPr>
           <w:p>
             <w:r>
@@ -2425,7 +2426,7 @@
         </w:tc>
         <w:tc>
           <w:tcPr>
-            <w:tcW w:w="1803" w:type="dxa"/>
+            <w:tcW w:w="1747" w:type="dxa"/>
           </w:tcPr>
           <w:p>
             <w:r>
@@ -2435,7 +2436,7 @@
         </w:tc>
         <w:tc>
           <w:tcPr>
-            <w:tcW w:w="1803" w:type="dxa"/>
+            <w:tcW w:w="3615" w:type="dxa"/>
           </w:tcPr>
           <w:p>
             <w:r>
@@ -2445,7 +2446,7 @@
         </w:tc>
         <w:tc>
           <w:tcPr>
-            <w:tcW w:w="1803" w:type="dxa"/>
+            <w:tcW w:w="1716" w:type="dxa"/>
           </w:tcPr>
           <w:p>
             <w:r>
@@ -2455,7 +2456,7 @@
         </w:tc>
         <w:tc>
           <w:tcPr>
-            <w:tcW w:w="1804" w:type="dxa"/>
+            <w:tcW w:w="1119" w:type="dxa"/>
           </w:tcPr>
           <w:p>
             <w:r>
@@ -2467,7 +2468,7 @@
       <w:tr>
         <w:tc>
           <w:tcPr>
-            <w:tcW w:w="1803" w:type="dxa"/>
+            <w:tcW w:w="819" w:type="dxa"/>
           </w:tcPr>
           <w:p>
             <w:r>
@@ -2477,7 +2478,7 @@
         </w:tc>
         <w:tc>
           <w:tcPr>
-            <w:tcW w:w="1803" w:type="dxa"/>
+            <w:tcW w:w="1747" w:type="dxa"/>
           </w:tcPr>
           <w:p>
             <w:r>
@@ -2487,7 +2488,7 @@
         </w:tc>
         <w:tc>
           <w:tcPr>
-            <w:tcW w:w="1803" w:type="dxa"/>
+            <w:tcW w:w="3615" w:type="dxa"/>
           </w:tcPr>
           <w:p>
             <w:r>
@@ -2497,7 +2498,7 @@
         </w:tc>
         <w:tc>
           <w:tcPr>
-            <w:tcW w:w="1803" w:type="dxa"/>
+            <w:tcW w:w="1716" w:type="dxa"/>
           </w:tcPr>
           <w:p>
             <w:r>
@@ -2507,7 +2508,7 @@
         </w:tc>
         <w:tc>
           <w:tcPr>
-            <w:tcW w:w="1804" w:type="dxa"/>
+            <w:tcW w:w="1119" w:type="dxa"/>
           </w:tcPr>
           <w:p>
             <w:r>
@@ -2519,7 +2520,7 @@
       <w:tr>
         <w:tc>
           <w:tcPr>
-            <w:tcW w:w="1803" w:type="dxa"/>
+            <w:tcW w:w="819" w:type="dxa"/>
           </w:tcPr>
           <w:p>
             <w:r>
@@ -2529,7 +2530,7 @@
         </w:tc>
         <w:tc>
           <w:tcPr>
-            <w:tcW w:w="1803" w:type="dxa"/>
+            <w:tcW w:w="1747" w:type="dxa"/>
           </w:tcPr>
           <w:p>
             <w:r>
@@ -2539,7 +2540,7 @@
         </w:tc>
         <w:tc>
           <w:tcPr>
-            <w:tcW w:w="1803" w:type="dxa"/>
+            <w:tcW w:w="3615" w:type="dxa"/>
           </w:tcPr>
           <w:p>
             <w:r>
@@ -2549,7 +2550,7 @@
         </w:tc>
         <w:tc>
           <w:tcPr>
-            <w:tcW w:w="1803" w:type="dxa"/>
+            <w:tcW w:w="1716" w:type="dxa"/>
           </w:tcPr>
           <w:p>
             <w:r>
@@ -2559,7 +2560,7 @@
         </w:tc>
         <w:tc>
           <w:tcPr>
-            <w:tcW w:w="1804" w:type="dxa"/>
+            <w:tcW w:w="1119" w:type="dxa"/>
           </w:tcPr>
           <w:p>
             <w:r>
@@ -2571,7 +2572,7 @@
       <w:tr>
         <w:tc>
           <w:tcPr>
-            <w:tcW w:w="1803" w:type="dxa"/>
+            <w:tcW w:w="819" w:type="dxa"/>
           </w:tcPr>
           <w:p>
             <w:r>
@@ -2581,7 +2582,7 @@
         </w:tc>
         <w:tc>
           <w:tcPr>
-            <w:tcW w:w="1803" w:type="dxa"/>
+            <w:tcW w:w="1747" w:type="dxa"/>
           </w:tcPr>
           <w:p>
             <w:r>
@@ -2591,7 +2592,7 @@
         </w:tc>
         <w:tc>
           <w:tcPr>
-            <w:tcW w:w="1803" w:type="dxa"/>
+            <w:tcW w:w="3615" w:type="dxa"/>
           </w:tcPr>
           <w:p>
             <w:r>
@@ -2601,7 +2602,7 @@
         </w:tc>
         <w:tc>
           <w:tcPr>
-            <w:tcW w:w="1803" w:type="dxa"/>
+            <w:tcW w:w="1716" w:type="dxa"/>
           </w:tcPr>
           <w:p>
             <w:r>
@@ -2611,7 +2612,7 @@
         </w:tc>
         <w:tc>
           <w:tcPr>
-            <w:tcW w:w="1804" w:type="dxa"/>
+            <w:tcW w:w="1119" w:type="dxa"/>
           </w:tcPr>
           <w:p>
             <w:r>
@@ -2623,7 +2624,7 @@
       <w:tr>
         <w:tc>
           <w:tcPr>
-            <w:tcW w:w="1803" w:type="dxa"/>
+            <w:tcW w:w="819" w:type="dxa"/>
           </w:tcPr>
           <w:p>
             <w:r>
@@ -2633,7 +2634,7 @@
         </w:tc>
         <w:tc>
           <w:tcPr>
-            <w:tcW w:w="1803" w:type="dxa"/>
+            <w:tcW w:w="1747" w:type="dxa"/>
           </w:tcPr>
           <w:p>
             <w:r>
@@ -2643,7 +2644,7 @@
         </w:tc>
         <w:tc>
           <w:tcPr>
-            <w:tcW w:w="1803" w:type="dxa"/>
+            <w:tcW w:w="3615" w:type="dxa"/>
           </w:tcPr>
           <w:p>
             <w:r>
@@ -2653,7 +2654,7 @@
         </w:tc>
         <w:tc>
           <w:tcPr>
-            <w:tcW w:w="1803" w:type="dxa"/>
+            <w:tcW w:w="1716" w:type="dxa"/>
           </w:tcPr>
           <w:p>
             <w:r>
@@ -2663,7 +2664,7 @@
         </w:tc>
         <w:tc>
           <w:tcPr>
-            <w:tcW w:w="1804" w:type="dxa"/>
+            <w:tcW w:w="1119" w:type="dxa"/>
           </w:tcPr>
           <w:p>
             <w:r>
@@ -2675,7 +2676,7 @@
       <w:tr>
         <w:tc>
           <w:tcPr>
-            <w:tcW w:w="1803" w:type="dxa"/>
+            <w:tcW w:w="819" w:type="dxa"/>
           </w:tcPr>
           <w:p>
             <w:r>
@@ -2685,7 +2686,7 @@
         </w:tc>
         <w:tc>
           <w:tcPr>
-            <w:tcW w:w="1803" w:type="dxa"/>
+            <w:tcW w:w="1747" w:type="dxa"/>
           </w:tcPr>
           <w:p>
             <w:r>
@@ -2695,7 +2696,7 @@
         </w:tc>
         <w:tc>
           <w:tcPr>
-            <w:tcW w:w="1803" w:type="dxa"/>
+            <w:tcW w:w="3615" w:type="dxa"/>
           </w:tcPr>
           <w:p>
             <w:r>
@@ -2705,7 +2706,7 @@
         </w:tc>
         <w:tc>
           <w:tcPr>
-            <w:tcW w:w="1803" w:type="dxa"/>
+            <w:tcW w:w="1716" w:type="dxa"/>
           </w:tcPr>
           <w:p>
             <w:r>
@@ -2715,7 +2716,7 @@
         </w:tc>
         <w:tc>
           <w:tcPr>
-            <w:tcW w:w="1804" w:type="dxa"/>
+            <w:tcW w:w="1119" w:type="dxa"/>
           </w:tcPr>
           <w:p>
             <w:r>
@@ -2727,7 +2728,7 @@
       <w:tr>
         <w:tc>
           <w:tcPr>
-            <w:tcW w:w="1803" w:type="dxa"/>
+            <w:tcW w:w="819" w:type="dxa"/>
           </w:tcPr>
           <w:p>
             <w:r>
@@ -2737,7 +2738,7 @@
         </w:tc>
         <w:tc>
           <w:tcPr>
-            <w:tcW w:w="1803" w:type="dxa"/>
+            <w:tcW w:w="1747" w:type="dxa"/>
           </w:tcPr>
           <w:p>
             <w:r>
@@ -2747,7 +2748,7 @@
         </w:tc>
         <w:tc>
           <w:tcPr>
-            <w:tcW w:w="1803" w:type="dxa"/>
+            <w:tcW w:w="3615" w:type="dxa"/>
           </w:tcPr>
           <w:p>
             <w:r>
@@ -2757,7 +2758,7 @@
         </w:tc>
         <w:tc>
           <w:tcPr>
-            <w:tcW w:w="1803" w:type="dxa"/>
+            <w:tcW w:w="1716" w:type="dxa"/>
           </w:tcPr>
           <w:p>
             <w:r>
@@ -2771,7 +2772,7 @@
         </w:tc>
         <w:tc>
           <w:tcPr>
-            <w:tcW w:w="1804" w:type="dxa"/>
+            <w:tcW w:w="1119" w:type="dxa"/>
           </w:tcPr>
           <w:p>
             <w:r>
@@ -2784,7 +2785,7 @@
       <w:tr>
         <w:tc>
           <w:tcPr>
-            <w:tcW w:w="1803" w:type="dxa"/>
+            <w:tcW w:w="819" w:type="dxa"/>
           </w:tcPr>
           <w:p>
             <w:r>
@@ -2794,7 +2795,7 @@
         </w:tc>
         <w:tc>
           <w:tcPr>
-            <w:tcW w:w="1803" w:type="dxa"/>
+            <w:tcW w:w="1747" w:type="dxa"/>
           </w:tcPr>
           <w:p>
             <w:r>
@@ -2804,7 +2805,7 @@
         </w:tc>
         <w:tc>
           <w:tcPr>
-            <w:tcW w:w="1803" w:type="dxa"/>
+            <w:tcW w:w="3615" w:type="dxa"/>
           </w:tcPr>
           <w:p>
             <w:r>
@@ -2814,7 +2815,7 @@
         </w:tc>
         <w:tc>
           <w:tcPr>
-            <w:tcW w:w="1803" w:type="dxa"/>
+            <w:tcW w:w="1716" w:type="dxa"/>
           </w:tcPr>
           <w:p>
             <w:r>
@@ -2824,7 +2825,7 @@
         </w:tc>
         <w:tc>
           <w:tcPr>
-            <w:tcW w:w="1804" w:type="dxa"/>
+            <w:tcW w:w="1119" w:type="dxa"/>
           </w:tcPr>
           <w:p>
             <w:r>
@@ -2836,7 +2837,7 @@
       <w:tr>
         <w:tc>
           <w:tcPr>
-            <w:tcW w:w="1803" w:type="dxa"/>
+            <w:tcW w:w="819" w:type="dxa"/>
           </w:tcPr>
           <w:p>
             <w:r>
@@ -2846,7 +2847,7 @@
         </w:tc>
         <w:tc>
           <w:tcPr>
-            <w:tcW w:w="1803" w:type="dxa"/>
+            <w:tcW w:w="1747" w:type="dxa"/>
           </w:tcPr>
           <w:p>
             <w:r>
@@ -2856,23 +2857,17 @@
         </w:tc>
         <w:tc>
           <w:tcPr>
-            <w:tcW w:w="1803" w:type="dxa"/>
-          </w:tcPr>
-          <w:p>
-            <w:r>
-              <w:t xml:space="preserve">Safety-critical requests (e.g. broken perimeter security) flagged "High" severity shall be visibly </w:t>
-            </w:r>
-            <w:r>
-              <w:t>distinguished</w:t>
-            </w:r>
-            <w:r>
-              <w:t xml:space="preserve"> from routine requests in the staff queue</w:t>
-            </w:r>
-          </w:p>
-        </w:tc>
-        <w:tc>
-          <w:tcPr>
-            <w:tcW w:w="1803" w:type="dxa"/>
+            <w:tcW w:w="3615" w:type="dxa"/>
+          </w:tcPr>
+          <w:p>
+            <w:r>
+              <w:t>Safety-critical requests (e.g. broken perimeter security) flagged "High" severity shall be visibly distinguished from routine requests in the staff queue</w:t>
+            </w:r>
+          </w:p>
+        </w:tc>
+        <w:tc>
+          <w:tcPr>
+            <w:tcW w:w="1716" w:type="dxa"/>
           </w:tcPr>
           <w:p>
             <w:r>
@@ -2882,7 +2877,7 @@
         </w:tc>
         <w:tc>
           <w:tcPr>
-            <w:tcW w:w="1804" w:type="dxa"/>
+            <w:tcW w:w="1119" w:type="dxa"/>
           </w:tcPr>
           <w:p>
             <w:r>
@@ -2894,7 +2889,7 @@
       <w:tr>
         <w:tc>
           <w:tcPr>
-            <w:tcW w:w="1803" w:type="dxa"/>
+            <w:tcW w:w="819" w:type="dxa"/>
           </w:tcPr>
           <w:p>
             <w:r>
@@ -2904,7 +2899,7 @@
         </w:tc>
         <w:tc>
           <w:tcPr>
-            <w:tcW w:w="1803" w:type="dxa"/>
+            <w:tcW w:w="1747" w:type="dxa"/>
           </w:tcPr>
           <w:p>
             <w:r>
@@ -2914,7 +2909,7 @@
         </w:tc>
         <w:tc>
           <w:tcPr>
-            <w:tcW w:w="1803" w:type="dxa"/>
+            <w:tcW w:w="3615" w:type="dxa"/>
           </w:tcPr>
           <w:p>
             <w:r>
@@ -2924,7 +2919,7 @@
         </w:tc>
         <w:tc>
           <w:tcPr>
-            <w:tcW w:w="1803" w:type="dxa"/>
+            <w:tcW w:w="1716" w:type="dxa"/>
           </w:tcPr>
           <w:p>
             <w:r>
@@ -2934,7 +2929,7 @@
         </w:tc>
         <w:tc>
           <w:tcPr>
-            <w:tcW w:w="1804" w:type="dxa"/>
+            <w:tcW w:w="1119" w:type="dxa"/>
           </w:tcPr>
           <w:p>
             <w:r>
@@ -2946,7 +2941,7 @@
       <w:tr>
         <w:tc>
           <w:tcPr>
-            <w:tcW w:w="1803" w:type="dxa"/>
+            <w:tcW w:w="819" w:type="dxa"/>
           </w:tcPr>
           <w:p>
             <w:r>
@@ -2956,7 +2951,7 @@
         </w:tc>
         <w:tc>
           <w:tcPr>
-            <w:tcW w:w="1803" w:type="dxa"/>
+            <w:tcW w:w="1747" w:type="dxa"/>
           </w:tcPr>
           <w:p>
             <w:r>
@@ -2966,7 +2961,7 @@
         </w:tc>
         <w:tc>
           <w:tcPr>
-            <w:tcW w:w="1803" w:type="dxa"/>
+            <w:tcW w:w="3615" w:type="dxa"/>
           </w:tcPr>
           <w:p>
             <w:r>
@@ -2976,7 +2971,7 @@
         </w:tc>
         <w:tc>
           <w:tcPr>
-            <w:tcW w:w="1803" w:type="dxa"/>
+            <w:tcW w:w="1716" w:type="dxa"/>
           </w:tcPr>
           <w:p>
             <w:r>
@@ -2986,7 +2981,7 @@
         </w:tc>
         <w:tc>
           <w:tcPr>
-            <w:tcW w:w="1804" w:type="dxa"/>
+            <w:tcW w:w="1119" w:type="dxa"/>
           </w:tcPr>
           <w:p>
             <w:r>
@@ -2998,7 +2993,7 @@
       <w:tr>
         <w:tc>
           <w:tcPr>
-            <w:tcW w:w="1803" w:type="dxa"/>
+            <w:tcW w:w="819" w:type="dxa"/>
           </w:tcPr>
           <w:p>
             <w:r>
@@ -3008,7 +3003,7 @@
         </w:tc>
         <w:tc>
           <w:tcPr>
-            <w:tcW w:w="1803" w:type="dxa"/>
+            <w:tcW w:w="1747" w:type="dxa"/>
           </w:tcPr>
           <w:p>
             <w:r>
@@ -3018,7 +3013,7 @@
         </w:tc>
         <w:tc>
           <w:tcPr>
-            <w:tcW w:w="1803" w:type="dxa"/>
+            <w:tcW w:w="3615" w:type="dxa"/>
           </w:tcPr>
           <w:p>
             <w:r>
@@ -3028,7 +3023,7 @@
         </w:tc>
         <w:tc>
           <w:tcPr>
-            <w:tcW w:w="1803" w:type="dxa"/>
+            <w:tcW w:w="1716" w:type="dxa"/>
           </w:tcPr>
           <w:p>
             <w:r>
@@ -3038,7 +3033,7 @@
         </w:tc>
         <w:tc>
           <w:tcPr>
-            <w:tcW w:w="1804" w:type="dxa"/>
+            <w:tcW w:w="1119" w:type="dxa"/>
           </w:tcPr>
           <w:p>
             <w:r>
@@ -3050,7 +3045,7 @@
       <w:tr>
         <w:tc>
           <w:tcPr>
-            <w:tcW w:w="1803" w:type="dxa"/>
+            <w:tcW w:w="819" w:type="dxa"/>
           </w:tcPr>
           <w:p>
             <w:r>
@@ -3060,7 +3055,7 @@
         </w:tc>
         <w:tc>
           <w:tcPr>
-            <w:tcW w:w="1803" w:type="dxa"/>
+            <w:tcW w:w="1747" w:type="dxa"/>
           </w:tcPr>
           <w:p>
             <w:r>
@@ -3070,23 +3065,23 @@
         </w:tc>
         <w:tc>
           <w:tcPr>
-            <w:tcW w:w="1803" w:type="dxa"/>
-          </w:tcPr>
-          <w:p>
-            <w:r>
-              <w:t xml:space="preserve">Data model shall associate all requests/users with a single complex entity, to avoid architectural </w:t>
-            </w:r>
-            <w:r>
-              <w:t>rework</w:t>
-            </w:r>
-            <w:r>
-              <w:t xml:space="preserve"> if multi-tenant support is added later</w:t>
-            </w:r>
-          </w:p>
-        </w:tc>
-        <w:tc>
-          <w:tcPr>
-            <w:tcW w:w="1803" w:type="dxa"/>
+            <w:tcW w:w="3615" w:type="dxa"/>
+          </w:tcPr>
+          <w:p>
+            <w:r>
+              <w:t>Data model shall associate all requests/users with a single complex entity, to avoid architectural re</w:t>
+            </w:r>
+            <w:r>
+              <w:t>w</w:t>
+            </w:r>
+            <w:r>
+              <w:t>ork if multi-tenant support is added later</w:t>
+            </w:r>
+          </w:p>
+        </w:tc>
+        <w:tc>
+          <w:tcPr>
+            <w:tcW w:w="1716" w:type="dxa"/>
           </w:tcPr>
           <w:p>
             <w:r>
@@ -3096,7 +3091,7 @@
         </w:tc>
         <w:tc>
           <w:tcPr>
-            <w:tcW w:w="1804" w:type="dxa"/>
+            <w:tcW w:w="1119" w:type="dxa"/>
           </w:tcPr>
           <w:p>
             <w:r>
@@ -3573,13 +3568,23 @@
         </w:tc>
       </w:tr>
     </w:tbl>
-    <w:p/>
     <w:p>
       <w:pPr>
+        <w:sectPr>
+          <w:pgSz w:w="11906" w:h="16838"/>
+          <w:pgMar w:top="1440" w:right="1440" w:bottom="1440" w:left="1440" w:header="708" w:footer="708" w:gutter="0"/>
+          <w:cols w:space="708"/>
+          <w:docGrid w:linePitch="360"/>
+        </w:sectPr>
+      </w:pPr>
+    </w:p>
+    <w:p>
+      <w:pPr>
         <w:pStyle w:val="Heading1"/>
       </w:pPr>
       <w:bookmarkStart w:id="8" w:name="_Toc239883848"/>
       <w:r>
+        <w:lastRenderedPageBreak/>
         <w:t>Requirements Traceability Matrix (RTM)</w:t>
       </w:r>
       <w:bookmarkEnd w:id="8"/>
@@ -3587,75 +3592,200 @@
     <w:tbl>
       <w:tblPr>
         <w:tblStyle w:val="TableGrid"/>
-        <w:tblW w:w="0" w:type="auto"/>
+        <w:tblW w:w="14350" w:type="dxa"/>
+        <w:tblInd w:w="-289" w:type="dxa"/>
+        <w:tblLayout w:type="fixed"/>
         <w:tblLook w:val="04A0" w:firstRow="1" w:lastRow="0" w:firstColumn="1" w:lastColumn="0" w:noHBand="0" w:noVBand="1"/>
       </w:tblPr>
       <w:tblGrid>
-        <w:gridCol w:w="970"/>
-        <w:gridCol w:w="2270"/>
-        <w:gridCol w:w="1473"/>
-        <w:gridCol w:w="1491"/>
-        <w:gridCol w:w="1491"/>
-        <w:gridCol w:w="1321"/>
+        <w:gridCol w:w="739"/>
+        <w:gridCol w:w="2517"/>
+        <w:gridCol w:w="1642"/>
+        <w:gridCol w:w="1760"/>
+        <w:gridCol w:w="1559"/>
+        <w:gridCol w:w="1276"/>
+        <w:gridCol w:w="1276"/>
+        <w:gridCol w:w="1276"/>
+        <w:gridCol w:w="2305"/>
       </w:tblGrid>
       <w:tr>
         <w:tc>
           <w:tcPr>
-            <w:tcW w:w="1502" w:type="dxa"/>
-          </w:tcPr>
-          <w:p>
-            <w:r>
+            <w:tcW w:w="739" w:type="dxa"/>
+          </w:tcPr>
+          <w:p>
+            <w:pPr>
+              <w:rPr>
+                <w:b/>
+                <w:bCs/>
+              </w:rPr>
+            </w:pPr>
+            <w:r>
+              <w:rPr>
+                <w:b/>
+                <w:bCs/>
+              </w:rPr>
               <w:t>Req ID</w:t>
             </w:r>
           </w:p>
         </w:tc>
         <w:tc>
           <w:tcPr>
-            <w:tcW w:w="1502" w:type="dxa"/>
-          </w:tcPr>
-          <w:p>
-            <w:r>
+            <w:tcW w:w="2517" w:type="dxa"/>
+          </w:tcPr>
+          <w:p>
+            <w:pPr>
+              <w:rPr>
+                <w:b/>
+                <w:bCs/>
+              </w:rPr>
+            </w:pPr>
+            <w:r>
+              <w:rPr>
+                <w:b/>
+                <w:bCs/>
+              </w:rPr>
               <w:t>Source/Stakeholder</w:t>
             </w:r>
           </w:p>
         </w:tc>
         <w:tc>
           <w:tcPr>
-            <w:tcW w:w="1503" w:type="dxa"/>
-          </w:tcPr>
-          <w:p>
-            <w:r>
+            <w:tcW w:w="1642" w:type="dxa"/>
+          </w:tcPr>
+          <w:p>
+            <w:pPr>
+              <w:rPr>
+                <w:b/>
+                <w:bCs/>
+              </w:rPr>
+            </w:pPr>
+            <w:r>
+              <w:rPr>
+                <w:b/>
+                <w:bCs/>
+              </w:rPr>
               <w:t>Acceptance Criteria</w:t>
             </w:r>
           </w:p>
         </w:tc>
         <w:tc>
           <w:tcPr>
-            <w:tcW w:w="1503" w:type="dxa"/>
-          </w:tcPr>
-          <w:p>
-            <w:r>
+            <w:tcW w:w="1760" w:type="dxa"/>
+          </w:tcPr>
+          <w:p>
+            <w:pPr>
+              <w:rPr>
+                <w:b/>
+                <w:bCs/>
+              </w:rPr>
+            </w:pPr>
+            <w:r>
+              <w:rPr>
+                <w:b/>
+                <w:bCs/>
+              </w:rPr>
               <w:t>Design (to be determined)</w:t>
             </w:r>
           </w:p>
         </w:tc>
         <w:tc>
           <w:tcPr>
-            <w:tcW w:w="1503" w:type="dxa"/>
-          </w:tcPr>
-          <w:p>
-            <w:r>
+            <w:tcW w:w="1559" w:type="dxa"/>
+          </w:tcPr>
+          <w:p>
+            <w:pPr>
+              <w:rPr>
+                <w:b/>
+                <w:bCs/>
+              </w:rPr>
+            </w:pPr>
+            <w:r>
+              <w:rPr>
+                <w:b/>
+                <w:bCs/>
+              </w:rPr>
               <w:t>Test (to be determined)</w:t>
             </w:r>
           </w:p>
         </w:tc>
         <w:tc>
           <w:tcPr>
-            <w:tcW w:w="1503" w:type="dxa"/>
-          </w:tcPr>
-          <w:p>
-            <w:r>
+            <w:tcW w:w="1276" w:type="dxa"/>
+          </w:tcPr>
+          <w:p>
+            <w:pPr>
+              <w:rPr>
+                <w:b/>
+                <w:bCs/>
+              </w:rPr>
+            </w:pPr>
+            <w:r>
+              <w:rPr>
+                <w:b/>
+                <w:bCs/>
+              </w:rPr>
               <w:t>Status</w:t>
+            </w:r>
+          </w:p>
+        </w:tc>
+        <w:tc>
+          <w:tcPr>
+            <w:tcW w:w="1276" w:type="dxa"/>
+          </w:tcPr>
+          <w:p>
+            <w:pPr>
+              <w:rPr>
+                <w:b/>
+                <w:bCs/>
+              </w:rPr>
+            </w:pPr>
+            <w:r>
+              <w:rPr>
+                <w:b/>
+                <w:bCs/>
+              </w:rPr>
+              <w:t>Baseline Note</w:t>
+            </w:r>
+          </w:p>
+        </w:tc>
+        <w:tc>
+          <w:tcPr>
+            <w:tcW w:w="1276" w:type="dxa"/>
+          </w:tcPr>
+          <w:p>
+            <w:pPr>
+              <w:rPr>
+                <w:b/>
+                <w:bCs/>
+              </w:rPr>
+            </w:pPr>
+            <w:r>
+              <w:rPr>
+                <w:b/>
+                <w:bCs/>
+              </w:rPr>
+              <w:t>ASR link</w:t>
+            </w:r>
+          </w:p>
+        </w:tc>
+        <w:tc>
+          <w:tcPr>
+            <w:tcW w:w="2305" w:type="dxa"/>
+          </w:tcPr>
+          <w:p>
+            <w:pPr>
+              <w:rPr>
+                <w:b/>
+                <w:bCs/>
+              </w:rPr>
+            </w:pPr>
+            <w:r>
+              <w:rPr>
+                <w:b/>
+                <w:bCs/>
+              </w:rPr>
+              <w:t>Architecture / Layer Allocation</w:t>
             </w:r>
           </w:p>
         </w:tc>
@@ -3663,7 +3793,7 @@
       <w:tr>
         <w:tc>
           <w:tcPr>
-            <w:tcW w:w="1502" w:type="dxa"/>
+            <w:tcW w:w="739" w:type="dxa"/>
           </w:tcPr>
           <w:p>
             <w:r>
@@ -3673,7 +3803,7 @@
         </w:tc>
         <w:tc>
           <w:tcPr>
-            <w:tcW w:w="1502" w:type="dxa"/>
+            <w:tcW w:w="2517" w:type="dxa"/>
           </w:tcPr>
           <w:p>
             <w:r>
@@ -3683,7 +3813,7 @@
         </w:tc>
         <w:tc>
           <w:tcPr>
-            <w:tcW w:w="1503" w:type="dxa"/>
+            <w:tcW w:w="1642" w:type="dxa"/>
           </w:tcPr>
           <w:p>
             <w:r>
@@ -3693,7 +3823,7 @@
         </w:tc>
         <w:tc>
           <w:tcPr>
-            <w:tcW w:w="1503" w:type="dxa"/>
+            <w:tcW w:w="1760" w:type="dxa"/>
           </w:tcPr>
           <w:p>
             <w:r>
@@ -3703,7 +3833,7 @@
         </w:tc>
         <w:tc>
           <w:tcPr>
-            <w:tcW w:w="1503" w:type="dxa"/>
+            <w:tcW w:w="1559" w:type="dxa"/>
           </w:tcPr>
           <w:p>
             <w:r>
@@ -3713,11 +3843,49 @@
         </w:tc>
         <w:tc>
           <w:tcPr>
-            <w:tcW w:w="1503" w:type="dxa"/>
+            <w:tcW w:w="1276" w:type="dxa"/>
           </w:tcPr>
           <w:p>
             <w:r>
               <w:t>Baselined</w:t>
+            </w:r>
+          </w:p>
+        </w:tc>
+        <w:tc>
+          <w:tcPr>
+            <w:tcW w:w="1276" w:type="dxa"/>
+          </w:tcPr>
+          <w:p>
+            <w:r>
+              <w:t>-</w:t>
+            </w:r>
+          </w:p>
+        </w:tc>
+        <w:tc>
+          <w:tcPr>
+            <w:tcW w:w="1276" w:type="dxa"/>
+          </w:tcPr>
+          <w:p>
+            <w:r>
+              <w:t>-</w:t>
+            </w:r>
+          </w:p>
+        </w:tc>
+        <w:tc>
+          <w:tcPr>
+            <w:tcW w:w="2305" w:type="dxa"/>
+          </w:tcPr>
+          <w:p>
+            <w:r>
+              <w:t>API (endpoint) + Service (</w:t>
+            </w:r>
+            <w:proofErr w:type="spellStart"/>
+            <w:r>
+              <w:t>RequestFactory</w:t>
+            </w:r>
+            <w:proofErr w:type="spellEnd"/>
+            <w:r>
+              <w:t>)</w:t>
             </w:r>
           </w:p>
         </w:tc>
@@ -3725,7 +3893,7 @@
       <w:tr>
         <w:tc>
           <w:tcPr>
-            <w:tcW w:w="1502" w:type="dxa"/>
+            <w:tcW w:w="739" w:type="dxa"/>
           </w:tcPr>
           <w:p>
             <w:r>
@@ -3735,7 +3903,7 @@
         </w:tc>
         <w:tc>
           <w:tcPr>
-            <w:tcW w:w="1502" w:type="dxa"/>
+            <w:tcW w:w="2517" w:type="dxa"/>
           </w:tcPr>
           <w:p>
             <w:r>
@@ -3745,7 +3913,7 @@
         </w:tc>
         <w:tc>
           <w:tcPr>
-            <w:tcW w:w="1503" w:type="dxa"/>
+            <w:tcW w:w="1642" w:type="dxa"/>
           </w:tcPr>
           <w:p>
             <w:r>
@@ -3755,7 +3923,7 @@
         </w:tc>
         <w:tc>
           <w:tcPr>
-            <w:tcW w:w="1503" w:type="dxa"/>
+            <w:tcW w:w="1760" w:type="dxa"/>
           </w:tcPr>
           <w:p>
             <w:r>
@@ -3765,7 +3933,7 @@
         </w:tc>
         <w:tc>
           <w:tcPr>
-            <w:tcW w:w="1503" w:type="dxa"/>
+            <w:tcW w:w="1559" w:type="dxa"/>
           </w:tcPr>
           <w:p>
             <w:r>
@@ -3775,11 +3943,41 @@
         </w:tc>
         <w:tc>
           <w:tcPr>
-            <w:tcW w:w="1503" w:type="dxa"/>
+            <w:tcW w:w="1276" w:type="dxa"/>
           </w:tcPr>
           <w:p>
             <w:r>
               <w:t>Baselined</w:t>
+            </w:r>
+          </w:p>
+        </w:tc>
+        <w:tc>
+          <w:tcPr>
+            <w:tcW w:w="1276" w:type="dxa"/>
+          </w:tcPr>
+          <w:p>
+            <w:r>
+              <w:t>-</w:t>
+            </w:r>
+          </w:p>
+        </w:tc>
+        <w:tc>
+          <w:tcPr>
+            <w:tcW w:w="1276" w:type="dxa"/>
+          </w:tcPr>
+          <w:p>
+            <w:r>
+              <w:t>-</w:t>
+            </w:r>
+          </w:p>
+        </w:tc>
+        <w:tc>
+          <w:tcPr>
+            <w:tcW w:w="2305" w:type="dxa"/>
+          </w:tcPr>
+          <w:p>
+            <w:r>
+              <w:t>API + Service (state-machine rules, §4.1 baseline review) + Persistence (transaction)</w:t>
             </w:r>
           </w:p>
         </w:tc>
@@ -3787,7 +3985,7 @@
       <w:tr>
         <w:tc>
           <w:tcPr>
-            <w:tcW w:w="1502" w:type="dxa"/>
+            <w:tcW w:w="739" w:type="dxa"/>
           </w:tcPr>
           <w:p>
             <w:r>
@@ -3797,7 +3995,7 @@
         </w:tc>
         <w:tc>
           <w:tcPr>
-            <w:tcW w:w="1502" w:type="dxa"/>
+            <w:tcW w:w="2517" w:type="dxa"/>
           </w:tcPr>
           <w:p>
             <w:r>
@@ -3807,7 +4005,7 @@
         </w:tc>
         <w:tc>
           <w:tcPr>
-            <w:tcW w:w="1503" w:type="dxa"/>
+            <w:tcW w:w="1642" w:type="dxa"/>
           </w:tcPr>
           <w:p>
             <w:r>
@@ -3817,7 +4015,7 @@
         </w:tc>
         <w:tc>
           <w:tcPr>
-            <w:tcW w:w="1503" w:type="dxa"/>
+            <w:tcW w:w="1760" w:type="dxa"/>
           </w:tcPr>
           <w:p>
             <w:r>
@@ -3827,7 +4025,7 @@
         </w:tc>
         <w:tc>
           <w:tcPr>
-            <w:tcW w:w="1503" w:type="dxa"/>
+            <w:tcW w:w="1559" w:type="dxa"/>
           </w:tcPr>
           <w:p>
             <w:r>
@@ -3837,11 +4035,41 @@
         </w:tc>
         <w:tc>
           <w:tcPr>
-            <w:tcW w:w="1503" w:type="dxa"/>
+            <w:tcW w:w="1276" w:type="dxa"/>
           </w:tcPr>
           <w:p>
             <w:r>
               <w:t>Baselined</w:t>
+            </w:r>
+          </w:p>
+        </w:tc>
+        <w:tc>
+          <w:tcPr>
+            <w:tcW w:w="1276" w:type="dxa"/>
+          </w:tcPr>
+          <w:p>
+            <w:r>
+              <w:t>-</w:t>
+            </w:r>
+          </w:p>
+        </w:tc>
+        <w:tc>
+          <w:tcPr>
+            <w:tcW w:w="1276" w:type="dxa"/>
+          </w:tcPr>
+          <w:p>
+            <w:r>
+              <w:t>-</w:t>
+            </w:r>
+          </w:p>
+        </w:tc>
+        <w:tc>
+          <w:tcPr>
+            <w:tcW w:w="2305" w:type="dxa"/>
+          </w:tcPr>
+          <w:p>
+            <w:r>
+              <w:t>API + Persistence (query)</w:t>
             </w:r>
           </w:p>
         </w:tc>
@@ -3849,18 +4077,17 @@
       <w:tr>
         <w:tc>
           <w:tcPr>
-            <w:tcW w:w="1502" w:type="dxa"/>
-          </w:tcPr>
-          <w:p>
-            <w:r>
-              <w:lastRenderedPageBreak/>
+            <w:tcW w:w="739" w:type="dxa"/>
+          </w:tcPr>
+          <w:p>
+            <w:r>
               <w:t>FR-004</w:t>
             </w:r>
           </w:p>
         </w:tc>
         <w:tc>
           <w:tcPr>
-            <w:tcW w:w="1502" w:type="dxa"/>
+            <w:tcW w:w="2517" w:type="dxa"/>
           </w:tcPr>
           <w:p>
             <w:r>
@@ -3870,7 +4097,7 @@
         </w:tc>
         <w:tc>
           <w:tcPr>
-            <w:tcW w:w="1503" w:type="dxa"/>
+            <w:tcW w:w="1642" w:type="dxa"/>
           </w:tcPr>
           <w:p>
             <w:r>
@@ -3880,7 +4107,7 @@
         </w:tc>
         <w:tc>
           <w:tcPr>
-            <w:tcW w:w="1503" w:type="dxa"/>
+            <w:tcW w:w="1760" w:type="dxa"/>
           </w:tcPr>
           <w:p>
             <w:r>
@@ -3890,7 +4117,7 @@
         </w:tc>
         <w:tc>
           <w:tcPr>
-            <w:tcW w:w="1503" w:type="dxa"/>
+            <w:tcW w:w="1559" w:type="dxa"/>
           </w:tcPr>
           <w:p>
             <w:r>
@@ -3900,11 +4127,49 @@
         </w:tc>
         <w:tc>
           <w:tcPr>
-            <w:tcW w:w="1503" w:type="dxa"/>
+            <w:tcW w:w="1276" w:type="dxa"/>
           </w:tcPr>
           <w:p>
             <w:r>
               <w:t>Baselined</w:t>
+            </w:r>
+          </w:p>
+        </w:tc>
+        <w:tc>
+          <w:tcPr>
+            <w:tcW w:w="1276" w:type="dxa"/>
+          </w:tcPr>
+          <w:p>
+            <w:r>
+              <w:t>-</w:t>
+            </w:r>
+          </w:p>
+        </w:tc>
+        <w:tc>
+          <w:tcPr>
+            <w:tcW w:w="1276" w:type="dxa"/>
+          </w:tcPr>
+          <w:p>
+            <w:r>
+              <w:t>-</w:t>
+            </w:r>
+          </w:p>
+        </w:tc>
+        <w:tc>
+          <w:tcPr>
+            <w:tcW w:w="2305" w:type="dxa"/>
+          </w:tcPr>
+          <w:p>
+            <w:r>
+              <w:t>Service (</w:t>
+            </w:r>
+            <w:proofErr w:type="spellStart"/>
+            <w:r>
+              <w:t>ResidentNotificationObserver</w:t>
+            </w:r>
+            <w:proofErr w:type="spellEnd"/>
+            <w:r>
+              <w:t>)</w:t>
             </w:r>
           </w:p>
         </w:tc>
@@ -3912,7 +4177,7 @@
       <w:tr>
         <w:tc>
           <w:tcPr>
-            <w:tcW w:w="1502" w:type="dxa"/>
+            <w:tcW w:w="739" w:type="dxa"/>
           </w:tcPr>
           <w:p>
             <w:r>
@@ -3922,7 +4187,7 @@
         </w:tc>
         <w:tc>
           <w:tcPr>
-            <w:tcW w:w="1502" w:type="dxa"/>
+            <w:tcW w:w="2517" w:type="dxa"/>
           </w:tcPr>
           <w:p>
             <w:r>
@@ -3932,7 +4197,7 @@
         </w:tc>
         <w:tc>
           <w:tcPr>
-            <w:tcW w:w="1503" w:type="dxa"/>
+            <w:tcW w:w="1642" w:type="dxa"/>
           </w:tcPr>
           <w:p>
             <w:r>
@@ -3942,7 +4207,7 @@
         </w:tc>
         <w:tc>
           <w:tcPr>
-            <w:tcW w:w="1503" w:type="dxa"/>
+            <w:tcW w:w="1760" w:type="dxa"/>
           </w:tcPr>
           <w:p>
             <w:r>
@@ -3952,7 +4217,7 @@
         </w:tc>
         <w:tc>
           <w:tcPr>
-            <w:tcW w:w="1503" w:type="dxa"/>
+            <w:tcW w:w="1559" w:type="dxa"/>
           </w:tcPr>
           <w:p>
             <w:r>
@@ -3962,11 +4227,41 @@
         </w:tc>
         <w:tc>
           <w:tcPr>
-            <w:tcW w:w="1503" w:type="dxa"/>
+            <w:tcW w:w="1276" w:type="dxa"/>
           </w:tcPr>
           <w:p>
             <w:r>
               <w:t>Baselined</w:t>
+            </w:r>
+          </w:p>
+        </w:tc>
+        <w:tc>
+          <w:tcPr>
+            <w:tcW w:w="1276" w:type="dxa"/>
+          </w:tcPr>
+          <w:p>
+            <w:r>
+              <w:t>-</w:t>
+            </w:r>
+          </w:p>
+        </w:tc>
+        <w:tc>
+          <w:tcPr>
+            <w:tcW w:w="1276" w:type="dxa"/>
+          </w:tcPr>
+          <w:p>
+            <w:r>
+              <w:t>-</w:t>
+            </w:r>
+          </w:p>
+        </w:tc>
+        <w:tc>
+          <w:tcPr>
+            <w:tcW w:w="2305" w:type="dxa"/>
+          </w:tcPr>
+          <w:p>
+            <w:r>
+              <w:t>API + Persistence (query/index)</w:t>
             </w:r>
           </w:p>
         </w:tc>
@@ -3974,17 +4269,18 @@
       <w:tr>
         <w:tc>
           <w:tcPr>
-            <w:tcW w:w="1502" w:type="dxa"/>
-          </w:tcPr>
-          <w:p>
-            <w:r>
+            <w:tcW w:w="739" w:type="dxa"/>
+          </w:tcPr>
+          <w:p>
+            <w:r>
+              <w:lastRenderedPageBreak/>
               <w:t>FR-006</w:t>
             </w:r>
           </w:p>
         </w:tc>
         <w:tc>
           <w:tcPr>
-            <w:tcW w:w="1502" w:type="dxa"/>
+            <w:tcW w:w="2517" w:type="dxa"/>
           </w:tcPr>
           <w:p>
             <w:r>
@@ -3994,7 +4290,7 @@
         </w:tc>
         <w:tc>
           <w:tcPr>
-            <w:tcW w:w="1503" w:type="dxa"/>
+            <w:tcW w:w="1642" w:type="dxa"/>
           </w:tcPr>
           <w:p>
             <w:r>
@@ -4004,7 +4300,7 @@
         </w:tc>
         <w:tc>
           <w:tcPr>
-            <w:tcW w:w="1503" w:type="dxa"/>
+            <w:tcW w:w="1760" w:type="dxa"/>
           </w:tcPr>
           <w:p>
             <w:r>
@@ -4014,7 +4310,7 @@
         </w:tc>
         <w:tc>
           <w:tcPr>
-            <w:tcW w:w="1503" w:type="dxa"/>
+            <w:tcW w:w="1559" w:type="dxa"/>
           </w:tcPr>
           <w:p>
             <w:r>
@@ -4024,11 +4320,41 @@
         </w:tc>
         <w:tc>
           <w:tcPr>
-            <w:tcW w:w="1503" w:type="dxa"/>
+            <w:tcW w:w="1276" w:type="dxa"/>
           </w:tcPr>
           <w:p>
             <w:r>
               <w:t>Baselined</w:t>
+            </w:r>
+          </w:p>
+        </w:tc>
+        <w:tc>
+          <w:tcPr>
+            <w:tcW w:w="1276" w:type="dxa"/>
+          </w:tcPr>
+          <w:p>
+            <w:r>
+              <w:t>-</w:t>
+            </w:r>
+          </w:p>
+        </w:tc>
+        <w:tc>
+          <w:tcPr>
+            <w:tcW w:w="1276" w:type="dxa"/>
+          </w:tcPr>
+          <w:p>
+            <w:r>
+              <w:t>-</w:t>
+            </w:r>
+          </w:p>
+        </w:tc>
+        <w:tc>
+          <w:tcPr>
+            <w:tcW w:w="2305" w:type="dxa"/>
+          </w:tcPr>
+          <w:p>
+            <w:r>
+              <w:t>API + Service</w:t>
             </w:r>
           </w:p>
         </w:tc>
@@ -4036,7 +4362,7 @@
       <w:tr>
         <w:tc>
           <w:tcPr>
-            <w:tcW w:w="1502" w:type="dxa"/>
+            <w:tcW w:w="739" w:type="dxa"/>
           </w:tcPr>
           <w:p>
             <w:r>
@@ -4046,7 +4372,7 @@
         </w:tc>
         <w:tc>
           <w:tcPr>
-            <w:tcW w:w="1502" w:type="dxa"/>
+            <w:tcW w:w="2517" w:type="dxa"/>
           </w:tcPr>
           <w:p>
             <w:r>
@@ -4056,7 +4382,7 @@
         </w:tc>
         <w:tc>
           <w:tcPr>
-            <w:tcW w:w="1503" w:type="dxa"/>
+            <w:tcW w:w="1642" w:type="dxa"/>
           </w:tcPr>
           <w:p>
             <w:r>
@@ -4066,7 +4392,7 @@
         </w:tc>
         <w:tc>
           <w:tcPr>
-            <w:tcW w:w="1503" w:type="dxa"/>
+            <w:tcW w:w="1760" w:type="dxa"/>
           </w:tcPr>
           <w:p>
             <w:r>
@@ -4076,7 +4402,7 @@
         </w:tc>
         <w:tc>
           <w:tcPr>
-            <w:tcW w:w="1503" w:type="dxa"/>
+            <w:tcW w:w="1559" w:type="dxa"/>
           </w:tcPr>
           <w:p>
             <w:r>
@@ -4086,11 +4412,41 @@
         </w:tc>
         <w:tc>
           <w:tcPr>
-            <w:tcW w:w="1503" w:type="dxa"/>
+            <w:tcW w:w="1276" w:type="dxa"/>
           </w:tcPr>
           <w:p>
             <w:r>
               <w:t>Baselined</w:t>
+            </w:r>
+          </w:p>
+        </w:tc>
+        <w:tc>
+          <w:tcPr>
+            <w:tcW w:w="1276" w:type="dxa"/>
+          </w:tcPr>
+          <w:p>
+            <w:r>
+              <w:t>-</w:t>
+            </w:r>
+          </w:p>
+        </w:tc>
+        <w:tc>
+          <w:tcPr>
+            <w:tcW w:w="1276" w:type="dxa"/>
+          </w:tcPr>
+          <w:p>
+            <w:r>
+              <w:t>-</w:t>
+            </w:r>
+          </w:p>
+        </w:tc>
+        <w:tc>
+          <w:tcPr>
+            <w:tcW w:w="2305" w:type="dxa"/>
+          </w:tcPr>
+          <w:p>
+            <w:r>
+              <w:t>API + Service + Persistence</w:t>
             </w:r>
           </w:p>
         </w:tc>
@@ -4098,7 +4454,7 @@
       <w:tr>
         <w:tc>
           <w:tcPr>
-            <w:tcW w:w="1502" w:type="dxa"/>
+            <w:tcW w:w="739" w:type="dxa"/>
           </w:tcPr>
           <w:p>
             <w:r>
@@ -4108,7 +4464,7 @@
         </w:tc>
         <w:tc>
           <w:tcPr>
-            <w:tcW w:w="1502" w:type="dxa"/>
+            <w:tcW w:w="2517" w:type="dxa"/>
           </w:tcPr>
           <w:p>
             <w:r>
@@ -4118,7 +4474,7 @@
         </w:tc>
         <w:tc>
           <w:tcPr>
-            <w:tcW w:w="1503" w:type="dxa"/>
+            <w:tcW w:w="1642" w:type="dxa"/>
           </w:tcPr>
           <w:p>
             <w:r>
@@ -4128,7 +4484,7 @@
         </w:tc>
         <w:tc>
           <w:tcPr>
-            <w:tcW w:w="1503" w:type="dxa"/>
+            <w:tcW w:w="1760" w:type="dxa"/>
           </w:tcPr>
           <w:p>
             <w:r>
@@ -4138,7 +4494,7 @@
         </w:tc>
         <w:tc>
           <w:tcPr>
-            <w:tcW w:w="1503" w:type="dxa"/>
+            <w:tcW w:w="1559" w:type="dxa"/>
           </w:tcPr>
           <w:p>
             <w:r>
@@ -4148,11 +4504,49 @@
         </w:tc>
         <w:tc>
           <w:tcPr>
-            <w:tcW w:w="1503" w:type="dxa"/>
+            <w:tcW w:w="1276" w:type="dxa"/>
           </w:tcPr>
           <w:p>
             <w:r>
               <w:t>Baselined</w:t>
+            </w:r>
+          </w:p>
+        </w:tc>
+        <w:tc>
+          <w:tcPr>
+            <w:tcW w:w="1276" w:type="dxa"/>
+          </w:tcPr>
+          <w:p>
+            <w:r>
+              <w:t>-</w:t>
+            </w:r>
+          </w:p>
+        </w:tc>
+        <w:tc>
+          <w:tcPr>
+            <w:tcW w:w="1276" w:type="dxa"/>
+          </w:tcPr>
+          <w:p>
+            <w:r>
+              <w:t>-</w:t>
+            </w:r>
+          </w:p>
+        </w:tc>
+        <w:tc>
+          <w:tcPr>
+            <w:tcW w:w="2305" w:type="dxa"/>
+          </w:tcPr>
+          <w:p>
+            <w:r>
+              <w:t>Service (</w:t>
+            </w:r>
+            <w:proofErr w:type="spellStart"/>
+            <w:r>
+              <w:t>DashboardCountObserver</w:t>
+            </w:r>
+            <w:proofErr w:type="spellEnd"/>
+            <w:r>
+              <w:t>) + Persistence</w:t>
             </w:r>
           </w:p>
         </w:tc>
@@ -4160,7 +4554,7 @@
       <w:tr>
         <w:tc>
           <w:tcPr>
-            <w:tcW w:w="1502" w:type="dxa"/>
+            <w:tcW w:w="739" w:type="dxa"/>
           </w:tcPr>
           <w:p>
             <w:r>
@@ -4170,7 +4564,7 @@
         </w:tc>
         <w:tc>
           <w:tcPr>
-            <w:tcW w:w="1502" w:type="dxa"/>
+            <w:tcW w:w="2517" w:type="dxa"/>
           </w:tcPr>
           <w:p>
             <w:r>
@@ -4180,7 +4574,7 @@
         </w:tc>
         <w:tc>
           <w:tcPr>
-            <w:tcW w:w="1503" w:type="dxa"/>
+            <w:tcW w:w="1642" w:type="dxa"/>
           </w:tcPr>
           <w:p>
             <w:r>
@@ -4190,7 +4584,7 @@
         </w:tc>
         <w:tc>
           <w:tcPr>
-            <w:tcW w:w="1503" w:type="dxa"/>
+            <w:tcW w:w="1760" w:type="dxa"/>
           </w:tcPr>
           <w:p>
             <w:r>
@@ -4200,7 +4594,7 @@
         </w:tc>
         <w:tc>
           <w:tcPr>
-            <w:tcW w:w="1503" w:type="dxa"/>
+            <w:tcW w:w="1559" w:type="dxa"/>
           </w:tcPr>
           <w:p>
             <w:r>
@@ -4210,11 +4604,41 @@
         </w:tc>
         <w:tc>
           <w:tcPr>
-            <w:tcW w:w="1503" w:type="dxa"/>
+            <w:tcW w:w="1276" w:type="dxa"/>
           </w:tcPr>
           <w:p>
             <w:r>
               <w:t>Baselined</w:t>
+            </w:r>
+          </w:p>
+        </w:tc>
+        <w:tc>
+          <w:tcPr>
+            <w:tcW w:w="1276" w:type="dxa"/>
+          </w:tcPr>
+          <w:p>
+            <w:r>
+              <w:t>-</w:t>
+            </w:r>
+          </w:p>
+        </w:tc>
+        <w:tc>
+          <w:tcPr>
+            <w:tcW w:w="1276" w:type="dxa"/>
+          </w:tcPr>
+          <w:p>
+            <w:r>
+              <w:t>-</w:t>
+            </w:r>
+          </w:p>
+        </w:tc>
+        <w:tc>
+          <w:tcPr>
+            <w:tcW w:w="2305" w:type="dxa"/>
+          </w:tcPr>
+          <w:p>
+            <w:r>
+              <w:t>Persistence (query)</w:t>
             </w:r>
           </w:p>
         </w:tc>
@@ -4222,7 +4646,7 @@
       <w:tr>
         <w:tc>
           <w:tcPr>
-            <w:tcW w:w="1502" w:type="dxa"/>
+            <w:tcW w:w="739" w:type="dxa"/>
           </w:tcPr>
           <w:p>
             <w:r>
@@ -4232,7 +4656,7 @@
         </w:tc>
         <w:tc>
           <w:tcPr>
-            <w:tcW w:w="1502" w:type="dxa"/>
+            <w:tcW w:w="2517" w:type="dxa"/>
           </w:tcPr>
           <w:p>
             <w:r>
@@ -4242,7 +4666,7 @@
         </w:tc>
         <w:tc>
           <w:tcPr>
-            <w:tcW w:w="1503" w:type="dxa"/>
+            <w:tcW w:w="1642" w:type="dxa"/>
           </w:tcPr>
           <w:p>
             <w:r>
@@ -4252,7 +4676,7 @@
         </w:tc>
         <w:tc>
           <w:tcPr>
-            <w:tcW w:w="1503" w:type="dxa"/>
+            <w:tcW w:w="1760" w:type="dxa"/>
           </w:tcPr>
           <w:p>
             <w:r>
@@ -4262,7 +4686,7 @@
         </w:tc>
         <w:tc>
           <w:tcPr>
-            <w:tcW w:w="1503" w:type="dxa"/>
+            <w:tcW w:w="1559" w:type="dxa"/>
           </w:tcPr>
           <w:p>
             <w:r>
@@ -4272,11 +4696,41 @@
         </w:tc>
         <w:tc>
           <w:tcPr>
-            <w:tcW w:w="1503" w:type="dxa"/>
+            <w:tcW w:w="1276" w:type="dxa"/>
           </w:tcPr>
           <w:p>
             <w:r>
               <w:t>Baselined</w:t>
+            </w:r>
+          </w:p>
+        </w:tc>
+        <w:tc>
+          <w:tcPr>
+            <w:tcW w:w="1276" w:type="dxa"/>
+          </w:tcPr>
+          <w:p>
+            <w:r>
+              <w:t>-</w:t>
+            </w:r>
+          </w:p>
+        </w:tc>
+        <w:tc>
+          <w:tcPr>
+            <w:tcW w:w="1276" w:type="dxa"/>
+          </w:tcPr>
+          <w:p>
+            <w:r>
+              <w:t>-</w:t>
+            </w:r>
+          </w:p>
+        </w:tc>
+        <w:tc>
+          <w:tcPr>
+            <w:tcW w:w="2305" w:type="dxa"/>
+          </w:tcPr>
+          <w:p>
+            <w:r>
+              <w:t>Service + Persistence</w:t>
             </w:r>
           </w:p>
         </w:tc>
@@ -4284,7 +4738,7 @@
       <w:tr>
         <w:tc>
           <w:tcPr>
-            <w:tcW w:w="1502" w:type="dxa"/>
+            <w:tcW w:w="739" w:type="dxa"/>
           </w:tcPr>
           <w:p>
             <w:r>
@@ -4294,7 +4748,7 @@
         </w:tc>
         <w:tc>
           <w:tcPr>
-            <w:tcW w:w="1502" w:type="dxa"/>
+            <w:tcW w:w="2517" w:type="dxa"/>
           </w:tcPr>
           <w:p>
             <w:r>
@@ -4304,7 +4758,7 @@
         </w:tc>
         <w:tc>
           <w:tcPr>
-            <w:tcW w:w="1503" w:type="dxa"/>
+            <w:tcW w:w="1642" w:type="dxa"/>
           </w:tcPr>
           <w:p>
             <w:r>
@@ -4314,7 +4768,7 @@
         </w:tc>
         <w:tc>
           <w:tcPr>
-            <w:tcW w:w="1503" w:type="dxa"/>
+            <w:tcW w:w="1760" w:type="dxa"/>
           </w:tcPr>
           <w:p>
             <w:r>
@@ -4324,7 +4778,7 @@
         </w:tc>
         <w:tc>
           <w:tcPr>
-            <w:tcW w:w="1503" w:type="dxa"/>
+            <w:tcW w:w="1559" w:type="dxa"/>
           </w:tcPr>
           <w:p>
             <w:r>
@@ -4334,11 +4788,41 @@
         </w:tc>
         <w:tc>
           <w:tcPr>
-            <w:tcW w:w="1503" w:type="dxa"/>
+            <w:tcW w:w="1276" w:type="dxa"/>
           </w:tcPr>
           <w:p>
             <w:r>
               <w:t>Baselined</w:t>
+            </w:r>
+          </w:p>
+        </w:tc>
+        <w:tc>
+          <w:tcPr>
+            <w:tcW w:w="1276" w:type="dxa"/>
+          </w:tcPr>
+          <w:p>
+            <w:r>
+              <w:t>Updated (M2)</w:t>
+            </w:r>
+          </w:p>
+        </w:tc>
+        <w:tc>
+          <w:tcPr>
+            <w:tcW w:w="1276" w:type="dxa"/>
+          </w:tcPr>
+          <w:p>
+            <w:r>
+              <w:t>ASR-3</w:t>
+            </w:r>
+          </w:p>
+        </w:tc>
+        <w:tc>
+          <w:tcPr>
+            <w:tcW w:w="2305" w:type="dxa"/>
+          </w:tcPr>
+          <w:p>
+            <w:r>
+              <w:t>Service (Factory + Observer trigger) + Persistence (field)</w:t>
             </w:r>
           </w:p>
         </w:tc>
@@ -4346,7 +4830,7 @@
       <w:tr>
         <w:tc>
           <w:tcPr>
-            <w:tcW w:w="1502" w:type="dxa"/>
+            <w:tcW w:w="739" w:type="dxa"/>
           </w:tcPr>
           <w:p>
             <w:r>
@@ -4356,7 +4840,7 @@
         </w:tc>
         <w:tc>
           <w:tcPr>
-            <w:tcW w:w="1502" w:type="dxa"/>
+            <w:tcW w:w="2517" w:type="dxa"/>
           </w:tcPr>
           <w:p>
             <w:r>
@@ -4366,7 +4850,7 @@
         </w:tc>
         <w:tc>
           <w:tcPr>
-            <w:tcW w:w="1503" w:type="dxa"/>
+            <w:tcW w:w="1642" w:type="dxa"/>
           </w:tcPr>
           <w:p>
             <w:r>
@@ -4376,7 +4860,7 @@
         </w:tc>
         <w:tc>
           <w:tcPr>
-            <w:tcW w:w="1503" w:type="dxa"/>
+            <w:tcW w:w="1760" w:type="dxa"/>
           </w:tcPr>
           <w:p>
             <w:r>
@@ -4386,7 +4870,7 @@
         </w:tc>
         <w:tc>
           <w:tcPr>
-            <w:tcW w:w="1503" w:type="dxa"/>
+            <w:tcW w:w="1559" w:type="dxa"/>
           </w:tcPr>
           <w:p>
             <w:r>
@@ -4396,11 +4880,41 @@
         </w:tc>
         <w:tc>
           <w:tcPr>
-            <w:tcW w:w="1503" w:type="dxa"/>
+            <w:tcW w:w="1276" w:type="dxa"/>
           </w:tcPr>
           <w:p>
             <w:r>
               <w:t>Baselined</w:t>
+            </w:r>
+          </w:p>
+        </w:tc>
+        <w:tc>
+          <w:tcPr>
+            <w:tcW w:w="1276" w:type="dxa"/>
+          </w:tcPr>
+          <w:p>
+            <w:r>
+              <w:t>-</w:t>
+            </w:r>
+          </w:p>
+        </w:tc>
+        <w:tc>
+          <w:tcPr>
+            <w:tcW w:w="1276" w:type="dxa"/>
+          </w:tcPr>
+          <w:p>
+            <w:r>
+              <w:t>ASR-1</w:t>
+            </w:r>
+          </w:p>
+        </w:tc>
+        <w:tc>
+          <w:tcPr>
+            <w:tcW w:w="2305" w:type="dxa"/>
+          </w:tcPr>
+          <w:p>
+            <w:r>
+              <w:t>API - auth middleware</w:t>
             </w:r>
           </w:p>
         </w:tc>
@@ -4408,7 +4922,7 @@
       <w:tr>
         <w:tc>
           <w:tcPr>
-            <w:tcW w:w="1502" w:type="dxa"/>
+            <w:tcW w:w="739" w:type="dxa"/>
           </w:tcPr>
           <w:p>
             <w:r>
@@ -4418,7 +4932,7 @@
         </w:tc>
         <w:tc>
           <w:tcPr>
-            <w:tcW w:w="1502" w:type="dxa"/>
+            <w:tcW w:w="2517" w:type="dxa"/>
           </w:tcPr>
           <w:p>
             <w:r>
@@ -4428,7 +4942,7 @@
         </w:tc>
         <w:tc>
           <w:tcPr>
-            <w:tcW w:w="1503" w:type="dxa"/>
+            <w:tcW w:w="1642" w:type="dxa"/>
           </w:tcPr>
           <w:p>
             <w:r>
@@ -4438,7 +4952,7 @@
         </w:tc>
         <w:tc>
           <w:tcPr>
-            <w:tcW w:w="1503" w:type="dxa"/>
+            <w:tcW w:w="1760" w:type="dxa"/>
           </w:tcPr>
           <w:p>
             <w:r>
@@ -4448,7 +4962,7 @@
         </w:tc>
         <w:tc>
           <w:tcPr>
-            <w:tcW w:w="1503" w:type="dxa"/>
+            <w:tcW w:w="1559" w:type="dxa"/>
           </w:tcPr>
           <w:p>
             <w:r>
@@ -4458,11 +4972,41 @@
         </w:tc>
         <w:tc>
           <w:tcPr>
-            <w:tcW w:w="1503" w:type="dxa"/>
+            <w:tcW w:w="1276" w:type="dxa"/>
           </w:tcPr>
           <w:p>
             <w:r>
               <w:t>overlaps with FR-011</w:t>
+            </w:r>
+          </w:p>
+        </w:tc>
+        <w:tc>
+          <w:tcPr>
+            <w:tcW w:w="1276" w:type="dxa"/>
+          </w:tcPr>
+          <w:p>
+            <w:r>
+              <w:t>Updated (M2)</w:t>
+            </w:r>
+          </w:p>
+        </w:tc>
+        <w:tc>
+          <w:tcPr>
+            <w:tcW w:w="1276" w:type="dxa"/>
+          </w:tcPr>
+          <w:p>
+            <w:r>
+              <w:t>ASR-3</w:t>
+            </w:r>
+          </w:p>
+        </w:tc>
+        <w:tc>
+          <w:tcPr>
+            <w:tcW w:w="2305" w:type="dxa"/>
+          </w:tcPr>
+          <w:p>
+            <w:r>
+              <w:t>Service (Factory + Observer trigger) + Persistence (field)</w:t>
             </w:r>
           </w:p>
         </w:tc>
@@ -4470,17 +5014,18 @@
       <w:tr>
         <w:tc>
           <w:tcPr>
-            <w:tcW w:w="1502" w:type="dxa"/>
-          </w:tcPr>
-          <w:p>
-            <w:r>
+            <w:tcW w:w="739" w:type="dxa"/>
+          </w:tcPr>
+          <w:p>
+            <w:r>
+              <w:lastRenderedPageBreak/>
               <w:t>NFR-003</w:t>
             </w:r>
           </w:p>
         </w:tc>
         <w:tc>
           <w:tcPr>
-            <w:tcW w:w="1502" w:type="dxa"/>
+            <w:tcW w:w="2517" w:type="dxa"/>
           </w:tcPr>
           <w:p>
             <w:r>
@@ -4490,7 +5035,7 @@
         </w:tc>
         <w:tc>
           <w:tcPr>
-            <w:tcW w:w="1503" w:type="dxa"/>
+            <w:tcW w:w="1642" w:type="dxa"/>
           </w:tcPr>
           <w:p>
             <w:r>
@@ -4500,7 +5045,7 @@
         </w:tc>
         <w:tc>
           <w:tcPr>
-            <w:tcW w:w="1503" w:type="dxa"/>
+            <w:tcW w:w="1760" w:type="dxa"/>
           </w:tcPr>
           <w:p>
             <w:r>
@@ -4510,7 +5055,7 @@
         </w:tc>
         <w:tc>
           <w:tcPr>
-            <w:tcW w:w="1503" w:type="dxa"/>
+            <w:tcW w:w="1559" w:type="dxa"/>
           </w:tcPr>
           <w:p>
             <w:r>
@@ -4520,11 +5065,41 @@
         </w:tc>
         <w:tc>
           <w:tcPr>
-            <w:tcW w:w="1503" w:type="dxa"/>
+            <w:tcW w:w="1276" w:type="dxa"/>
           </w:tcPr>
           <w:p>
             <w:r>
               <w:t>Baselined</w:t>
+            </w:r>
+          </w:p>
+        </w:tc>
+        <w:tc>
+          <w:tcPr>
+            <w:tcW w:w="1276" w:type="dxa"/>
+          </w:tcPr>
+          <w:p>
+            <w:r>
+              <w:t>-</w:t>
+            </w:r>
+          </w:p>
+        </w:tc>
+        <w:tc>
+          <w:tcPr>
+            <w:tcW w:w="1276" w:type="dxa"/>
+          </w:tcPr>
+          <w:p>
+            <w:r>
+              <w:t>-</w:t>
+            </w:r>
+          </w:p>
+        </w:tc>
+        <w:tc>
+          <w:tcPr>
+            <w:tcW w:w="2305" w:type="dxa"/>
+          </w:tcPr>
+          <w:p>
+            <w:r>
+              <w:t>Frontend/UI concern - not architecture-layer allocated</w:t>
             </w:r>
           </w:p>
         </w:tc>
@@ -4532,7 +5107,7 @@
       <w:tr>
         <w:tc>
           <w:tcPr>
-            <w:tcW w:w="1502" w:type="dxa"/>
+            <w:tcW w:w="739" w:type="dxa"/>
           </w:tcPr>
           <w:p>
             <w:r>
@@ -4542,17 +5117,22 @@
         </w:tc>
         <w:tc>
           <w:tcPr>
-            <w:tcW w:w="1502" w:type="dxa"/>
-          </w:tcPr>
-          <w:p>
-            <w:r>
-              <w:t>Accountability need</w:t>
-            </w:r>
-          </w:p>
-        </w:tc>
-        <w:tc>
-          <w:tcPr>
-            <w:tcW w:w="1503" w:type="dxa"/>
+            <w:tcW w:w="2517" w:type="dxa"/>
+          </w:tcPr>
+          <w:p>
+            <w:proofErr w:type="gramStart"/>
+            <w:r>
+              <w:t>Accountability</w:t>
+            </w:r>
+            <w:proofErr w:type="gramEnd"/>
+            <w:r>
+              <w:t xml:space="preserve"> need</w:t>
+            </w:r>
+          </w:p>
+        </w:tc>
+        <w:tc>
+          <w:tcPr>
+            <w:tcW w:w="1642" w:type="dxa"/>
           </w:tcPr>
           <w:p>
             <w:r>
@@ -4562,7 +5142,7 @@
         </w:tc>
         <w:tc>
           <w:tcPr>
-            <w:tcW w:w="1503" w:type="dxa"/>
+            <w:tcW w:w="1760" w:type="dxa"/>
           </w:tcPr>
           <w:p>
             <w:r>
@@ -4572,7 +5152,7 @@
         </w:tc>
         <w:tc>
           <w:tcPr>
-            <w:tcW w:w="1503" w:type="dxa"/>
+            <w:tcW w:w="1559" w:type="dxa"/>
           </w:tcPr>
           <w:p>
             <w:r>
@@ -4582,11 +5162,49 @@
         </w:tc>
         <w:tc>
           <w:tcPr>
-            <w:tcW w:w="1503" w:type="dxa"/>
+            <w:tcW w:w="1276" w:type="dxa"/>
           </w:tcPr>
           <w:p>
             <w:r>
               <w:t>Baselined</w:t>
+            </w:r>
+          </w:p>
+        </w:tc>
+        <w:tc>
+          <w:tcPr>
+            <w:tcW w:w="1276" w:type="dxa"/>
+          </w:tcPr>
+          <w:p>
+            <w:r>
+              <w:t>-</w:t>
+            </w:r>
+          </w:p>
+        </w:tc>
+        <w:tc>
+          <w:tcPr>
+            <w:tcW w:w="1276" w:type="dxa"/>
+          </w:tcPr>
+          <w:p>
+            <w:r>
+              <w:t>ASR-2</w:t>
+            </w:r>
+          </w:p>
+        </w:tc>
+        <w:tc>
+          <w:tcPr>
+            <w:tcW w:w="2305" w:type="dxa"/>
+          </w:tcPr>
+          <w:p>
+            <w:r>
+              <w:t>Persistence (</w:t>
+            </w:r>
+            <w:proofErr w:type="spellStart"/>
+            <w:r>
+              <w:t>AuditHistoryObserver</w:t>
+            </w:r>
+            <w:proofErr w:type="spellEnd"/>
+            <w:r>
+              <w:t xml:space="preserve"> + ACID transaction boundary)</w:t>
             </w:r>
           </w:p>
         </w:tc>
@@ -4594,7 +5212,7 @@
       <w:tr>
         <w:tc>
           <w:tcPr>
-            <w:tcW w:w="1502" w:type="dxa"/>
+            <w:tcW w:w="739" w:type="dxa"/>
           </w:tcPr>
           <w:p>
             <w:r>
@@ -4604,7 +5222,7 @@
         </w:tc>
         <w:tc>
           <w:tcPr>
-            <w:tcW w:w="1502" w:type="dxa"/>
+            <w:tcW w:w="2517" w:type="dxa"/>
           </w:tcPr>
           <w:p>
             <w:r>
@@ -4614,7 +5232,7 @@
         </w:tc>
         <w:tc>
           <w:tcPr>
-            <w:tcW w:w="1503" w:type="dxa"/>
+            <w:tcW w:w="1642" w:type="dxa"/>
           </w:tcPr>
           <w:p>
             <w:r>
@@ -4624,7 +5242,7 @@
         </w:tc>
         <w:tc>
           <w:tcPr>
-            <w:tcW w:w="1503" w:type="dxa"/>
+            <w:tcW w:w="1760" w:type="dxa"/>
           </w:tcPr>
           <w:p>
             <w:r>
@@ -4634,7 +5252,7 @@
         </w:tc>
         <w:tc>
           <w:tcPr>
-            <w:tcW w:w="1503" w:type="dxa"/>
+            <w:tcW w:w="1559" w:type="dxa"/>
           </w:tcPr>
           <w:p>
             <w:r>
@@ -4644,11 +5262,41 @@
         </w:tc>
         <w:tc>
           <w:tcPr>
-            <w:tcW w:w="1503" w:type="dxa"/>
+            <w:tcW w:w="1276" w:type="dxa"/>
           </w:tcPr>
           <w:p>
             <w:r>
               <w:t>Baselined</w:t>
+            </w:r>
+          </w:p>
+        </w:tc>
+        <w:tc>
+          <w:tcPr>
+            <w:tcW w:w="1276" w:type="dxa"/>
+          </w:tcPr>
+          <w:p>
+            <w:r>
+              <w:t>Pending — see §5.5</w:t>
+            </w:r>
+          </w:p>
+        </w:tc>
+        <w:tc>
+          <w:tcPr>
+            <w:tcW w:w="1276" w:type="dxa"/>
+          </w:tcPr>
+          <w:p>
+            <w:r>
+              <w:t>ASR-4</w:t>
+            </w:r>
+          </w:p>
+        </w:tc>
+        <w:tc>
+          <w:tcPr>
+            <w:tcW w:w="2305" w:type="dxa"/>
+          </w:tcPr>
+          <w:p>
+            <w:r>
+              <w:t>Persistence (indexing strategy)</w:t>
             </w:r>
           </w:p>
         </w:tc>
@@ -4656,7 +5304,7 @@
       <w:tr>
         <w:tc>
           <w:tcPr>
-            <w:tcW w:w="1502" w:type="dxa"/>
+            <w:tcW w:w="739" w:type="dxa"/>
           </w:tcPr>
           <w:p>
             <w:r>
@@ -4666,7 +5314,7 @@
         </w:tc>
         <w:tc>
           <w:tcPr>
-            <w:tcW w:w="1502" w:type="dxa"/>
+            <w:tcW w:w="2517" w:type="dxa"/>
           </w:tcPr>
           <w:p>
             <w:r>
@@ -4676,7 +5324,7 @@
         </w:tc>
         <w:tc>
           <w:tcPr>
-            <w:tcW w:w="1503" w:type="dxa"/>
+            <w:tcW w:w="1642" w:type="dxa"/>
           </w:tcPr>
           <w:p>
             <w:r>
@@ -4686,7 +5334,7 @@
         </w:tc>
         <w:tc>
           <w:tcPr>
-            <w:tcW w:w="1503" w:type="dxa"/>
+            <w:tcW w:w="1760" w:type="dxa"/>
           </w:tcPr>
           <w:p>
             <w:r>
@@ -4696,7 +5344,7 @@
         </w:tc>
         <w:tc>
           <w:tcPr>
-            <w:tcW w:w="1503" w:type="dxa"/>
+            <w:tcW w:w="1559" w:type="dxa"/>
           </w:tcPr>
           <w:p>
             <w:r>
@@ -4706,22 +5354,61 @@
         </w:tc>
         <w:tc>
           <w:tcPr>
-            <w:tcW w:w="1503" w:type="dxa"/>
+            <w:tcW w:w="1276" w:type="dxa"/>
           </w:tcPr>
           <w:p>
             <w:r>
               <w:t>Draft</w:t>
+            </w:r>
+          </w:p>
+        </w:tc>
+        <w:tc>
+          <w:tcPr>
+            <w:tcW w:w="1276" w:type="dxa"/>
+          </w:tcPr>
+          <w:p>
+            <w:r>
+              <w:t>Pending — see §5.4</w:t>
+            </w:r>
+          </w:p>
+        </w:tc>
+        <w:tc>
+          <w:tcPr>
+            <w:tcW w:w="1276" w:type="dxa"/>
+          </w:tcPr>
+          <w:p>
+            <w:r>
+              <w:t>-</w:t>
+            </w:r>
+          </w:p>
+        </w:tc>
+        <w:tc>
+          <w:tcPr>
+            <w:tcW w:w="2305" w:type="dxa"/>
+          </w:tcPr>
+          <w:p>
+            <w:r>
+              <w:t>Persistence (data model)</w:t>
             </w:r>
           </w:p>
         </w:tc>
       </w:tr>
     </w:tbl>
-    <w:p/>
     <w:p>
       <w:pPr>
+        <w:sectPr>
+          <w:pgSz w:w="16838" w:h="11906" w:orient="landscape"/>
+          <w:pgMar w:top="1440" w:right="1440" w:bottom="1440" w:left="1440" w:header="708" w:footer="708" w:gutter="0"/>
+          <w:cols w:space="708"/>
+          <w:docGrid w:linePitch="360"/>
+        </w:sectPr>
+      </w:pPr>
+      <w:bookmarkStart w:id="9" w:name="_Toc239883849"/>
+    </w:p>
+    <w:p>
+      <w:pPr>
         <w:pStyle w:val="Heading1"/>
       </w:pPr>
-      <w:bookmarkStart w:id="9" w:name="_Toc239883849"/>
       <w:r>
         <w:lastRenderedPageBreak/>
         <w:t>Constraints Analysis &amp; Architectural Trade-offs</w:t>
@@ -4940,11 +5627,11 @@
           </w:tcPr>
           <w:p>
             <w:r>
-              <w:t xml:space="preserve">Requirements must explicitly flag where residents' unit numbers, contact numbers, and maintenance records appear (NFR-002) so that Milestone 2 architecture incorporates boundary validation </w:t>
+              <w:t xml:space="preserve">Requirements must explicitly flag where residents' unit numbers, contact numbers, and maintenance records appear (NFR-002) so that Milestone 2 architecture </w:t>
             </w:r>
             <w:r>
               <w:lastRenderedPageBreak/>
-              <w:t>and authorization models from day one.</w:t>
+              <w:t>incorporates boundary validation and authorization models from day one.</w:t>
             </w:r>
           </w:p>
         </w:tc>
@@ -5071,24 +5758,25 @@
       <w:tblPr>
         <w:tblStyle w:val="TableGrid"/>
         <w:tblW w:w="14061" w:type="dxa"/>
+        <w:tblLayout w:type="fixed"/>
         <w:tblLook w:val="04A0" w:firstRow="1" w:lastRow="0" w:firstColumn="1" w:lastColumn="0" w:noHBand="0" w:noVBand="1"/>
       </w:tblPr>
       <w:tblGrid>
-        <w:gridCol w:w="876"/>
-        <w:gridCol w:w="1669"/>
-        <w:gridCol w:w="1867"/>
-        <w:gridCol w:w="1400"/>
+        <w:gridCol w:w="846"/>
+        <w:gridCol w:w="1701"/>
+        <w:gridCol w:w="1755"/>
+        <w:gridCol w:w="1459"/>
         <w:gridCol w:w="1063"/>
         <w:gridCol w:w="1063"/>
-        <w:gridCol w:w="1867"/>
+        <w:gridCol w:w="1902"/>
         <w:gridCol w:w="1806"/>
-        <w:gridCol w:w="1525"/>
-        <w:gridCol w:w="925"/>
+        <w:gridCol w:w="1192"/>
+        <w:gridCol w:w="1274"/>
       </w:tblGrid>
       <w:tr>
         <w:tc>
           <w:tcPr>
-            <w:tcW w:w="901" w:type="dxa"/>
+            <w:tcW w:w="846" w:type="dxa"/>
           </w:tcPr>
           <w:p>
             <w:pPr>
@@ -5108,7 +5796,7 @@
         </w:tc>
         <w:tc>
           <w:tcPr>
-            <w:tcW w:w="1669" w:type="dxa"/>
+            <w:tcW w:w="1701" w:type="dxa"/>
           </w:tcPr>
           <w:p>
             <w:pPr>
@@ -5128,7 +5816,7 @@
         </w:tc>
         <w:tc>
           <w:tcPr>
-            <w:tcW w:w="1867" w:type="dxa"/>
+            <w:tcW w:w="1755" w:type="dxa"/>
           </w:tcPr>
           <w:p>
             <w:pPr>
@@ -5148,7 +5836,7 @@
         </w:tc>
         <w:tc>
           <w:tcPr>
-            <w:tcW w:w="1320" w:type="dxa"/>
+            <w:tcW w:w="1459" w:type="dxa"/>
           </w:tcPr>
           <w:p>
             <w:pPr>
@@ -5208,7 +5896,7 @@
         </w:tc>
         <w:tc>
           <w:tcPr>
-            <w:tcW w:w="1867" w:type="dxa"/>
+            <w:tcW w:w="1902" w:type="dxa"/>
           </w:tcPr>
           <w:p>
             <w:pPr>
@@ -5248,7 +5936,7 @@
         </w:tc>
         <w:tc>
           <w:tcPr>
-            <w:tcW w:w="1603" w:type="dxa"/>
+            <w:tcW w:w="1192" w:type="dxa"/>
           </w:tcPr>
           <w:p>
             <w:pPr>
@@ -5268,7 +5956,7 @@
         </w:tc>
         <w:tc>
           <w:tcPr>
-            <w:tcW w:w="902" w:type="dxa"/>
+            <w:tcW w:w="1274" w:type="dxa"/>
           </w:tcPr>
           <w:p>
             <w:pPr>
@@ -5290,7 +5978,7 @@
       <w:tr>
         <w:tc>
           <w:tcPr>
-            <w:tcW w:w="901" w:type="dxa"/>
+            <w:tcW w:w="846" w:type="dxa"/>
           </w:tcPr>
           <w:p>
             <w:r>
@@ -5300,7 +5988,7 @@
         </w:tc>
         <w:tc>
           <w:tcPr>
-            <w:tcW w:w="1669" w:type="dxa"/>
+            <w:tcW w:w="1701" w:type="dxa"/>
           </w:tcPr>
           <w:p>
             <w:r>
@@ -5310,7 +5998,7 @@
         </w:tc>
         <w:tc>
           <w:tcPr>
-            <w:tcW w:w="1867" w:type="dxa"/>
+            <w:tcW w:w="1755" w:type="dxa"/>
           </w:tcPr>
           <w:p>
             <w:r>
@@ -5320,7 +6008,7 @@
         </w:tc>
         <w:tc>
           <w:tcPr>
-            <w:tcW w:w="1320" w:type="dxa"/>
+            <w:tcW w:w="1459" w:type="dxa"/>
           </w:tcPr>
           <w:p>
             <w:r>
@@ -5350,11 +6038,11 @@
         </w:tc>
         <w:tc>
           <w:tcPr>
-            <w:tcW w:w="1867" w:type="dxa"/>
-          </w:tcPr>
-          <w:p>
-            <w:r>
-              <w:t>Conduct small technical spikes in M2 before final selection; verify community support and documentation depth.</w:t>
+            <w:tcW w:w="1902" w:type="dxa"/>
+          </w:tcPr>
+          <w:p>
+            <w:r>
+              <w:t>[M2 Update] Selected Node.js/Express and React to maintain a unified JavaScript ecosystem, eliminating the need to learn Java/C#.</w:t>
             </w:r>
           </w:p>
         </w:tc>
@@ -5370,21 +6058,21 @@
         </w:tc>
         <w:tc>
           <w:tcPr>
-            <w:tcW w:w="1603" w:type="dxa"/>
-          </w:tcPr>
-          <w:p>
-            <w:r>
-              <w:t>Person B</w:t>
-            </w:r>
-          </w:p>
-        </w:tc>
-        <w:tc>
-          <w:tcPr>
-            <w:tcW w:w="902" w:type="dxa"/>
-          </w:tcPr>
-          <w:p>
-            <w:r>
-              <w:t>Open</w:t>
+            <w:tcW w:w="1192" w:type="dxa"/>
+          </w:tcPr>
+          <w:p>
+            <w:r>
+              <w:t>Jimmy</w:t>
+            </w:r>
+          </w:p>
+        </w:tc>
+        <w:tc>
+          <w:tcPr>
+            <w:tcW w:w="1274" w:type="dxa"/>
+          </w:tcPr>
+          <w:p>
+            <w:r>
+              <w:t>Mitigated / Reduced</w:t>
             </w:r>
           </w:p>
         </w:tc>
@@ -5392,7 +6080,7 @@
       <w:tr>
         <w:tc>
           <w:tcPr>
-            <w:tcW w:w="901" w:type="dxa"/>
+            <w:tcW w:w="846" w:type="dxa"/>
           </w:tcPr>
           <w:p>
             <w:r>
@@ -5402,36 +6090,36 @@
         </w:tc>
         <w:tc>
           <w:tcPr>
-            <w:tcW w:w="1669" w:type="dxa"/>
-          </w:tcPr>
-          <w:p>
-            <w:r>
-              <w:t xml:space="preserve">Residents' unit numbers and personal details are exposed via </w:t>
+            <w:tcW w:w="1701" w:type="dxa"/>
+          </w:tcPr>
+          <w:p>
+            <w:r>
+              <w:t xml:space="preserve">Residents' unit numbers and personal </w:t>
             </w:r>
             <w:r>
               <w:lastRenderedPageBreak/>
-              <w:t>unauthorized access or missing API boundaries.</w:t>
-            </w:r>
-          </w:p>
-        </w:tc>
-        <w:tc>
-          <w:tcPr>
-            <w:tcW w:w="1867" w:type="dxa"/>
+              <w:t>details are exposed via unauthorized access or missing API boundaries.</w:t>
+            </w:r>
+          </w:p>
+        </w:tc>
+        <w:tc>
+          <w:tcPr>
+            <w:tcW w:w="1755" w:type="dxa"/>
           </w:tcPr>
           <w:p>
             <w:r>
               <w:lastRenderedPageBreak/>
-              <w:t xml:space="preserve">Access control treated as an implementation afterthought rather than an </w:t>
+              <w:t>Access control treated as an implementatio</w:t>
             </w:r>
             <w:r>
               <w:lastRenderedPageBreak/>
-              <w:t>architectural baseline.</w:t>
-            </w:r>
-          </w:p>
-        </w:tc>
-        <w:tc>
-          <w:tcPr>
-            <w:tcW w:w="1320" w:type="dxa"/>
+              <w:t>n afterthought rather than an architectural baseline.</w:t>
+            </w:r>
+          </w:p>
+        </w:tc>
+        <w:tc>
+          <w:tcPr>
+            <w:tcW w:w="1459" w:type="dxa"/>
           </w:tcPr>
           <w:p>
             <w:r>
@@ -5462,15 +6150,15 @@
         </w:tc>
         <w:tc>
           <w:tcPr>
-            <w:tcW w:w="1867" w:type="dxa"/>
-          </w:tcPr>
-          <w:p>
-            <w:r>
-              <w:t xml:space="preserve">Embed NFR-002 into the M1 baseline; explicitly design role-based </w:t>
+            <w:tcW w:w="1902" w:type="dxa"/>
+          </w:tcPr>
+          <w:p>
+            <w:r>
+              <w:t xml:space="preserve">Embed NFR-002 into the M1 baseline; </w:t>
             </w:r>
             <w:r>
               <w:lastRenderedPageBreak/>
-              <w:t>access control (RBAC) in M2 architecture.</w:t>
+              <w:t>explicitly design role-based access control (RBAC) in M2 architecture.</w:t>
             </w:r>
           </w:p>
         </w:tc>
@@ -5481,28 +6169,28 @@
           <w:p>
             <w:r>
               <w:lastRenderedPageBreak/>
-              <w:t xml:space="preserve">Restrict service request visibility to system administrators </w:t>
+              <w:t xml:space="preserve">Restrict service request visibility to </w:t>
             </w:r>
             <w:r>
               <w:lastRenderedPageBreak/>
-              <w:t>until authorization schemas pass verification.</w:t>
-            </w:r>
-          </w:p>
-        </w:tc>
-        <w:tc>
-          <w:tcPr>
-            <w:tcW w:w="1603" w:type="dxa"/>
+              <w:t>system administrators until authorization schemas pass verification.</w:t>
+            </w:r>
+          </w:p>
+        </w:tc>
+        <w:tc>
+          <w:tcPr>
+            <w:tcW w:w="1192" w:type="dxa"/>
           </w:tcPr>
           <w:p>
             <w:r>
               <w:lastRenderedPageBreak/>
-              <w:t>Person B</w:t>
-            </w:r>
-          </w:p>
-        </w:tc>
-        <w:tc>
-          <w:tcPr>
-            <w:tcW w:w="902" w:type="dxa"/>
+              <w:t>Jimmy</w:t>
+            </w:r>
+          </w:p>
+        </w:tc>
+        <w:tc>
+          <w:tcPr>
+            <w:tcW w:w="1274" w:type="dxa"/>
           </w:tcPr>
           <w:p>
             <w:r>
@@ -5514,7 +6202,7 @@
       <w:tr>
         <w:tc>
           <w:tcPr>
-            <w:tcW w:w="901" w:type="dxa"/>
+            <w:tcW w:w="846" w:type="dxa"/>
           </w:tcPr>
           <w:p>
             <w:r>
@@ -5524,7 +6212,7 @@
         </w:tc>
         <w:tc>
           <w:tcPr>
-            <w:tcW w:w="1669" w:type="dxa"/>
+            <w:tcW w:w="1701" w:type="dxa"/>
           </w:tcPr>
           <w:p>
             <w:r>
@@ -5534,7 +6222,7 @@
         </w:tc>
         <w:tc>
           <w:tcPr>
-            <w:tcW w:w="1867" w:type="dxa"/>
+            <w:tcW w:w="1755" w:type="dxa"/>
           </w:tcPr>
           <w:p>
             <w:r>
@@ -5544,7 +6232,7 @@
         </w:tc>
         <w:tc>
           <w:tcPr>
-            <w:tcW w:w="1320" w:type="dxa"/>
+            <w:tcW w:w="1459" w:type="dxa"/>
           </w:tcPr>
           <w:p>
             <w:r>
@@ -5574,7 +6262,7 @@
         </w:tc>
         <w:tc>
           <w:tcPr>
-            <w:tcW w:w="1867" w:type="dxa"/>
+            <w:tcW w:w="1902" w:type="dxa"/>
           </w:tcPr>
           <w:p>
             <w:r>
@@ -5594,7 +6282,7 @@
         </w:tc>
         <w:tc>
           <w:tcPr>
-            <w:tcW w:w="1603" w:type="dxa"/>
+            <w:tcW w:w="1192" w:type="dxa"/>
           </w:tcPr>
           <w:p>
             <w:r>
@@ -5604,7 +6292,7 @@
         </w:tc>
         <w:tc>
           <w:tcPr>
-            <w:tcW w:w="902" w:type="dxa"/>
+            <w:tcW w:w="1274" w:type="dxa"/>
           </w:tcPr>
           <w:p>
             <w:r>
@@ -5616,7 +6304,7 @@
       <w:tr>
         <w:tc>
           <w:tcPr>
-            <w:tcW w:w="901" w:type="dxa"/>
+            <w:tcW w:w="846" w:type="dxa"/>
           </w:tcPr>
           <w:p>
             <w:r>
@@ -5626,35 +6314,40 @@
         </w:tc>
         <w:tc>
           <w:tcPr>
-            <w:tcW w:w="1669" w:type="dxa"/>
-          </w:tcPr>
-          <w:p>
-            <w:r>
-              <w:t xml:space="preserve">Free-tier hosting and database limits are exceeded when </w:t>
+            <w:tcW w:w="1701" w:type="dxa"/>
+          </w:tcPr>
+          <w:p>
+            <w:r>
+              <w:t xml:space="preserve">Free-tier hosting and database limits are </w:t>
             </w:r>
             <w:r>
               <w:lastRenderedPageBreak/>
-              <w:t>simulated multi-unit estate data is loaded in M3/M4.</w:t>
-            </w:r>
-          </w:p>
-        </w:tc>
-        <w:tc>
-          <w:tcPr>
-            <w:tcW w:w="1867" w:type="dxa"/>
+              <w:t>exceeded when simulated multi-unit estate data is loaded in M3.</w:t>
+            </w:r>
+          </w:p>
+        </w:tc>
+        <w:tc>
+          <w:tcPr>
+            <w:tcW w:w="1755" w:type="dxa"/>
           </w:tcPr>
           <w:p>
             <w:r>
               <w:lastRenderedPageBreak/>
-              <w:t>Total reliance on free cloud tiers without profiling resource footprints.</w:t>
-            </w:r>
-          </w:p>
-        </w:tc>
-        <w:tc>
-          <w:tcPr>
-            <w:tcW w:w="1320" w:type="dxa"/>
-          </w:tcPr>
-          <w:p>
-            <w:r>
+              <w:t xml:space="preserve">Total reliance on free cloud tiers without profiling </w:t>
+            </w:r>
+            <w:r>
+              <w:lastRenderedPageBreak/>
+              <w:t>resource footprints.</w:t>
+            </w:r>
+          </w:p>
+        </w:tc>
+        <w:tc>
+          <w:tcPr>
+            <w:tcW w:w="1459" w:type="dxa"/>
+          </w:tcPr>
+          <w:p>
+            <w:r>
+              <w:lastRenderedPageBreak/>
               <w:t>Medium</w:t>
             </w:r>
           </w:p>
@@ -5681,15 +6374,15 @@
         </w:tc>
         <w:tc>
           <w:tcPr>
-            <w:tcW w:w="1867" w:type="dxa"/>
-          </w:tcPr>
-          <w:p>
-            <w:r>
-              <w:t xml:space="preserve">Profile free-tier RAM/CPU limits prior to M2 tech selection; benchmark data footprints </w:t>
+            <w:tcW w:w="1902" w:type="dxa"/>
+          </w:tcPr>
+          <w:p>
+            <w:r>
+              <w:t xml:space="preserve">[M2 update] Baselined PostgreSQL via Supabase </w:t>
             </w:r>
             <w:r>
               <w:lastRenderedPageBreak/>
-              <w:t>against Wonderpark unit counts.</w:t>
+              <w:t>(500MB storage, 200 connections). Express API must explicitly close idle connections.</w:t>
             </w:r>
           </w:p>
         </w:tc>
@@ -5700,32 +6393,32 @@
           <w:p>
             <w:r>
               <w:lastRenderedPageBreak/>
-              <w:t xml:space="preserve">Temporarily migrate workload to low-cost paid tiers or local containerized </w:t>
+              <w:t xml:space="preserve">Temporarily migrate workload to low-cost paid </w:t>
             </w:r>
             <w:r>
               <w:lastRenderedPageBreak/>
-              <w:t>runners for demonstration.</w:t>
-            </w:r>
-          </w:p>
-        </w:tc>
-        <w:tc>
-          <w:tcPr>
-            <w:tcW w:w="1603" w:type="dxa"/>
+              <w:t>tiers or local containerized runners for demonstration.</w:t>
+            </w:r>
+          </w:p>
+        </w:tc>
+        <w:tc>
+          <w:tcPr>
+            <w:tcW w:w="1192" w:type="dxa"/>
           </w:tcPr>
           <w:p>
             <w:r>
               <w:lastRenderedPageBreak/>
-              <w:t>Person B</w:t>
-            </w:r>
-          </w:p>
-        </w:tc>
-        <w:tc>
-          <w:tcPr>
-            <w:tcW w:w="902" w:type="dxa"/>
-          </w:tcPr>
-          <w:p>
-            <w:r>
-              <w:t>Open</w:t>
+              <w:t>Jimmy</w:t>
+            </w:r>
+          </w:p>
+        </w:tc>
+        <w:tc>
+          <w:tcPr>
+            <w:tcW w:w="1274" w:type="dxa"/>
+          </w:tcPr>
+          <w:p>
+            <w:r>
+              <w:t>Monitored</w:t>
             </w:r>
           </w:p>
         </w:tc>
@@ -5733,7 +6426,7 @@
       <w:tr>
         <w:tc>
           <w:tcPr>
-            <w:tcW w:w="901" w:type="dxa"/>
+            <w:tcW w:w="846" w:type="dxa"/>
           </w:tcPr>
           <w:p>
             <w:r>
@@ -5743,7 +6436,7 @@
         </w:tc>
         <w:tc>
           <w:tcPr>
-            <w:tcW w:w="1669" w:type="dxa"/>
+            <w:tcW w:w="1701" w:type="dxa"/>
           </w:tcPr>
           <w:p>
             <w:r>
@@ -5753,7 +6446,7 @@
         </w:tc>
         <w:tc>
           <w:tcPr>
-            <w:tcW w:w="1867" w:type="dxa"/>
+            <w:tcW w:w="1755" w:type="dxa"/>
           </w:tcPr>
           <w:p>
             <w:r>
@@ -5763,7 +6456,7 @@
         </w:tc>
         <w:tc>
           <w:tcPr>
-            <w:tcW w:w="1320" w:type="dxa"/>
+            <w:tcW w:w="1459" w:type="dxa"/>
           </w:tcPr>
           <w:p>
             <w:r>
@@ -5793,7 +6486,7 @@
         </w:tc>
         <w:tc>
           <w:tcPr>
-            <w:tcW w:w="1867" w:type="dxa"/>
+            <w:tcW w:w="1902" w:type="dxa"/>
           </w:tcPr>
           <w:p>
             <w:r>
@@ -5813,7 +6506,7 @@
         </w:tc>
         <w:tc>
           <w:tcPr>
-            <w:tcW w:w="1603" w:type="dxa"/>
+            <w:tcW w:w="1192" w:type="dxa"/>
           </w:tcPr>
           <w:p>
             <w:r>
@@ -5823,7 +6516,7 @@
         </w:tc>
         <w:tc>
           <w:tcPr>
-            <w:tcW w:w="902" w:type="dxa"/>
+            <w:tcW w:w="1274" w:type="dxa"/>
           </w:tcPr>
           <w:p>
             <w:r>
@@ -5835,7 +6528,7 @@
       <w:tr>
         <w:tc>
           <w:tcPr>
-            <w:tcW w:w="901" w:type="dxa"/>
+            <w:tcW w:w="846" w:type="dxa"/>
           </w:tcPr>
           <w:p>
             <w:r>
@@ -5845,21 +6538,21 @@
         </w:tc>
         <w:tc>
           <w:tcPr>
-            <w:tcW w:w="1669" w:type="dxa"/>
-          </w:tcPr>
-          <w:p>
-            <w:r>
-              <w:t xml:space="preserve">Frontend and backend integration fails due to mismatched </w:t>
+            <w:tcW w:w="1701" w:type="dxa"/>
+          </w:tcPr>
+          <w:p>
+            <w:r>
+              <w:t xml:space="preserve">Frontend and backend integration fails due to </w:t>
             </w:r>
             <w:r>
               <w:lastRenderedPageBreak/>
-              <w:t>assumptions regarding ticket status-transition rules.</w:t>
-            </w:r>
-          </w:p>
-        </w:tc>
-        <w:tc>
-          <w:tcPr>
-            <w:tcW w:w="1867" w:type="dxa"/>
+              <w:t>mismatched assumptions regarding ticket status-transition rules.</w:t>
+            </w:r>
+          </w:p>
+        </w:tc>
+        <w:tc>
+          <w:tcPr>
+            <w:tcW w:w="1755" w:type="dxa"/>
           </w:tcPr>
           <w:p>
             <w:r>
@@ -5874,7 +6567,7 @@
         </w:tc>
         <w:tc>
           <w:tcPr>
-            <w:tcW w:w="1320" w:type="dxa"/>
+            <w:tcW w:w="1459" w:type="dxa"/>
           </w:tcPr>
           <w:p>
             <w:r>
@@ -5905,15 +6598,15 @@
         </w:tc>
         <w:tc>
           <w:tcPr>
-            <w:tcW w:w="1867" w:type="dxa"/>
-          </w:tcPr>
-          <w:p>
-            <w:r>
-              <w:t xml:space="preserve">Formalize state-transition matrices (FR-002) in the PED before any </w:t>
+            <w:tcW w:w="1902" w:type="dxa"/>
+          </w:tcPr>
+          <w:p>
+            <w:r>
+              <w:t xml:space="preserve">Formalize state-transition matrices (FR-002) in the PED </w:t>
             </w:r>
             <w:r>
               <w:lastRenderedPageBreak/>
-              <w:t>implementation begins in M2/M3.</w:t>
+              <w:t>before any implementation begins in M2/M3.</w:t>
             </w:r>
           </w:p>
         </w:tc>
@@ -5924,28 +6617,28 @@
           <w:p>
             <w:r>
               <w:lastRenderedPageBreak/>
-              <w:t xml:space="preserve">Rework the affected API endpoints and log the corrective </w:t>
+              <w:t xml:space="preserve">Rework the affected API endpoints and log the </w:t>
             </w:r>
             <w:r>
               <w:lastRenderedPageBreak/>
-              <w:t>decision in the Engineering Decision Log.</w:t>
-            </w:r>
-          </w:p>
-        </w:tc>
-        <w:tc>
-          <w:tcPr>
-            <w:tcW w:w="1603" w:type="dxa"/>
+              <w:t>corrective decision in the Engineering Decision Log.</w:t>
+            </w:r>
+          </w:p>
+        </w:tc>
+        <w:tc>
+          <w:tcPr>
+            <w:tcW w:w="1192" w:type="dxa"/>
           </w:tcPr>
           <w:p>
             <w:r>
               <w:lastRenderedPageBreak/>
-              <w:t>Person A + Dev</w:t>
-            </w:r>
-          </w:p>
-        </w:tc>
-        <w:tc>
-          <w:tcPr>
-            <w:tcW w:w="902" w:type="dxa"/>
+              <w:t>Karabo</w:t>
+            </w:r>
+          </w:p>
+        </w:tc>
+        <w:tc>
+          <w:tcPr>
+            <w:tcW w:w="1274" w:type="dxa"/>
           </w:tcPr>
           <w:p>
             <w:r>
@@ -5957,7 +6650,7 @@
       <w:tr>
         <w:tc>
           <w:tcPr>
-            <w:tcW w:w="901" w:type="dxa"/>
+            <w:tcW w:w="846" w:type="dxa"/>
           </w:tcPr>
           <w:p>
             <w:r>
@@ -5967,7 +6660,7 @@
         </w:tc>
         <w:tc>
           <w:tcPr>
-            <w:tcW w:w="1669" w:type="dxa"/>
+            <w:tcW w:w="1701" w:type="dxa"/>
           </w:tcPr>
           <w:p>
             <w:r>
@@ -5977,17 +6670,25 @@
         </w:tc>
         <w:tc>
           <w:tcPr>
-            <w:tcW w:w="1867" w:type="dxa"/>
-          </w:tcPr>
-          <w:p>
-            <w:r>
-              <w:t>Lack of cross-reviewing teammates' controlled artefacts.</w:t>
-            </w:r>
-          </w:p>
-        </w:tc>
-        <w:tc>
-          <w:tcPr>
-            <w:tcW w:w="1320" w:type="dxa"/>
+            <w:tcW w:w="1755" w:type="dxa"/>
+          </w:tcPr>
+          <w:p>
+            <w:r>
+              <w:t xml:space="preserve">Lack of cross-reviewing </w:t>
+            </w:r>
+            <w:proofErr w:type="gramStart"/>
+            <w:r>
+              <w:t>teammates' controlled</w:t>
+            </w:r>
+            <w:proofErr w:type="gramEnd"/>
+            <w:r>
+              <w:t xml:space="preserve"> artefacts.</w:t>
+            </w:r>
+          </w:p>
+        </w:tc>
+        <w:tc>
+          <w:tcPr>
+            <w:tcW w:w="1459" w:type="dxa"/>
           </w:tcPr>
           <w:p>
             <w:r>
@@ -6017,7 +6718,7 @@
         </w:tc>
         <w:tc>
           <w:tcPr>
-            <w:tcW w:w="1867" w:type="dxa"/>
+            <w:tcW w:w="1902" w:type="dxa"/>
           </w:tcPr>
           <w:p>
             <w:r>
@@ -6037,7 +6738,7 @@
         </w:tc>
         <w:tc>
           <w:tcPr>
-            <w:tcW w:w="1603" w:type="dxa"/>
+            <w:tcW w:w="1192" w:type="dxa"/>
           </w:tcPr>
           <w:p>
             <w:r>
@@ -6047,7 +6748,7 @@
         </w:tc>
         <w:tc>
           <w:tcPr>
-            <w:tcW w:w="902" w:type="dxa"/>
+            <w:tcW w:w="1274" w:type="dxa"/>
           </w:tcPr>
           <w:p>
             <w:r>
@@ -6059,7 +6760,7 @@
       <w:tr>
         <w:tc>
           <w:tcPr>
-            <w:tcW w:w="901" w:type="dxa"/>
+            <w:tcW w:w="846" w:type="dxa"/>
           </w:tcPr>
           <w:p>
             <w:r>
@@ -6069,36 +6770,36 @@
         </w:tc>
         <w:tc>
           <w:tcPr>
-            <w:tcW w:w="1669" w:type="dxa"/>
-          </w:tcPr>
-          <w:p>
-            <w:r>
-              <w:t xml:space="preserve">Residents abuse the "High" severity flag </w:t>
+            <w:tcW w:w="1701" w:type="dxa"/>
+          </w:tcPr>
+          <w:p>
+            <w:r>
+              <w:t xml:space="preserve">Residents abuse the "High" </w:t>
             </w:r>
             <w:r>
               <w:lastRenderedPageBreak/>
-              <w:t>to artificially expedite routine non-urgent maintenance requests.</w:t>
-            </w:r>
-          </w:p>
-        </w:tc>
-        <w:tc>
-          <w:tcPr>
-            <w:tcW w:w="1867" w:type="dxa"/>
+              <w:t>severity flag to artificially expedite routine non-urgent maintenance requests.</w:t>
+            </w:r>
+          </w:p>
+        </w:tc>
+        <w:tc>
+          <w:tcPr>
+            <w:tcW w:w="1755" w:type="dxa"/>
           </w:tcPr>
           <w:p>
             <w:r>
               <w:lastRenderedPageBreak/>
-              <w:t>Absence of validation controls on resident self-</w:t>
+              <w:t xml:space="preserve">Absence of validation controls on </w:t>
             </w:r>
             <w:r>
               <w:lastRenderedPageBreak/>
-              <w:t>assigned priority.</w:t>
-            </w:r>
-          </w:p>
-        </w:tc>
-        <w:tc>
-          <w:tcPr>
-            <w:tcW w:w="1320" w:type="dxa"/>
+              <w:t>resident self-assigned priority.</w:t>
+            </w:r>
+          </w:p>
+        </w:tc>
+        <w:tc>
+          <w:tcPr>
+            <w:tcW w:w="1459" w:type="dxa"/>
           </w:tcPr>
           <w:p>
             <w:r>
@@ -6129,15 +6830,15 @@
         </w:tc>
         <w:tc>
           <w:tcPr>
-            <w:tcW w:w="1867" w:type="dxa"/>
-          </w:tcPr>
-          <w:p>
-            <w:r>
-              <w:t xml:space="preserve">Implement staff triage controls (FR-002/FR-007) allowing </w:t>
+            <w:tcW w:w="1902" w:type="dxa"/>
+          </w:tcPr>
+          <w:p>
+            <w:r>
+              <w:t>Implement staff triage controls (FR-002/FR-</w:t>
             </w:r>
             <w:r>
               <w:lastRenderedPageBreak/>
-              <w:t>managing agents to reclassify ticket severity on review.</w:t>
+              <w:t>007) allowing managing agents to reclassify ticket severity on review.</w:t>
             </w:r>
           </w:p>
         </w:tc>
@@ -6148,28 +6849,28 @@
           <w:p>
             <w:r>
               <w:lastRenderedPageBreak/>
-              <w:t xml:space="preserve">Introduce an audit "severity disputed" status flag in </w:t>
+              <w:t xml:space="preserve">Introduce an audit "severity disputed" </w:t>
             </w:r>
             <w:r>
               <w:lastRenderedPageBreak/>
-              <w:t>future iterations if triage data indicates persistent misuse.</w:t>
-            </w:r>
-          </w:p>
-        </w:tc>
-        <w:tc>
-          <w:tcPr>
-            <w:tcW w:w="1603" w:type="dxa"/>
+              <w:t>status flag in future iterations if triage data indicates persistent misuse.</w:t>
+            </w:r>
+          </w:p>
+        </w:tc>
+        <w:tc>
+          <w:tcPr>
+            <w:tcW w:w="1192" w:type="dxa"/>
           </w:tcPr>
           <w:p>
             <w:r>
               <w:lastRenderedPageBreak/>
-              <w:t>Person B</w:t>
-            </w:r>
-          </w:p>
-        </w:tc>
-        <w:tc>
-          <w:tcPr>
-            <w:tcW w:w="902" w:type="dxa"/>
+              <w:t>Jimmy</w:t>
+            </w:r>
+          </w:p>
+        </w:tc>
+        <w:tc>
+          <w:tcPr>
+            <w:tcW w:w="1274" w:type="dxa"/>
           </w:tcPr>
           <w:p>
             <w:r>
@@ -6296,7 +6997,7 @@
                 <w:b/>
                 <w:bCs/>
               </w:rPr>
-              <w:t>What It Influences Later (M2–M4)</w:t>
+              <w:t>What It Influences Later (M2)</w:t>
             </w:r>
           </w:p>
         </w:tc>
@@ -6316,7 +7017,7 @@
                 <w:b/>
                 <w:bCs/>
               </w:rPr>
-              <w:t>Missing Information</w:t>
+              <w:t>Missing Information / M2 Status</w:t>
             </w:r>
           </w:p>
         </w:tc>
@@ -6368,7 +7069,11 @@
           </w:tcPr>
           <w:p>
             <w:r>
-              <w:t>Shapes NFR-002 and enforces distinct privilege boundaries between residents, maintenance staff, and managing agents.</w:t>
+              <w:t xml:space="preserve">Shapes NFR-002 and enforces distinct privilege boundaries between residents, </w:t>
+            </w:r>
+            <w:r>
+              <w:lastRenderedPageBreak/>
+              <w:t>maintenance staff, and managing agents.</w:t>
             </w:r>
           </w:p>
         </w:tc>
@@ -6378,6 +7083,7 @@
           </w:tcPr>
           <w:p>
             <w:r>
+              <w:lastRenderedPageBreak/>
               <w:t>Milestone 2 architecture decomposition and Milestone 3 access-control middleware.</w:t>
             </w:r>
           </w:p>
@@ -6388,7 +7094,11 @@
           </w:tcPr>
           <w:p>
             <w:r>
-              <w:t>Whether estate staff require fine-grained role tiers (e.g., security patrol vs. plumbing contractors).</w:t>
+              <w:t xml:space="preserve">[M2 Resolved]: Implemented stateless JSON Web Tokens (JWT) passed via the Authorization: </w:t>
+            </w:r>
+            <w:r>
+              <w:lastRenderedPageBreak/>
+              <w:t>Bearer header (ADR-INT1).</w:t>
             </w:r>
           </w:p>
         </w:tc>
@@ -6398,6 +7108,7 @@
           </w:tcPr>
           <w:p>
             <w:r>
+              <w:lastRenderedPageBreak/>
               <w:t>Extensive schema and route restructuring if access control is retrofitted onto an open prototype.</w:t>
             </w:r>
           </w:p>
@@ -6410,7 +7121,6 @@
           </w:tcPr>
           <w:p>
             <w:r>
-              <w:lastRenderedPageBreak/>
               <w:t>FEC-02</w:t>
             </w:r>
           </w:p>
@@ -6441,7 +7151,7 @@
           </w:tcPr>
           <w:p>
             <w:r>
-              <w:t>Milestone 2 technology selection and Milestone 4 production operations and costing.</w:t>
+              <w:t>Milestone 2 technology selection and Milestone 3 production operations and costing.</w:t>
             </w:r>
           </w:p>
         </w:tc>
@@ -6451,7 +7161,7 @@
           </w:tcPr>
           <w:p>
             <w:r>
-              <w:t>Exact container execution limits and database connection pools of available free-tier cloud hosts.</w:t>
+              <w:t>[M2 Pending]: Backend and frontend deployed via free-tier cloud containers (Render/Vercel); database hosted on Supabase (ADR-STACK1).</w:t>
             </w:r>
           </w:p>
         </w:tc>
@@ -6513,7 +7223,7 @@
           </w:tcPr>
           <w:p>
             <w:r>
-              <w:t>Specific statutory retention periods governing residential tenant communication records.</w:t>
+              <w:t>[M2 Pending]: Audit trail is preserved using PostgreSQL's native relational integrity and atomic multi-row transactions (ADR-DATA1).</w:t>
             </w:r>
           </w:p>
         </w:tc>
@@ -6535,6 +7245,7 @@
           </w:tcPr>
           <w:p>
             <w:r>
+              <w:lastRenderedPageBreak/>
               <w:t>FEC-04</w:t>
             </w:r>
           </w:p>
@@ -6597,7 +7308,6 @@
           </w:tcPr>
           <w:p>
             <w:r>
-              <w:lastRenderedPageBreak/>
               <w:t>FEC-05</w:t>
             </w:r>
           </w:p>
@@ -6628,7 +7338,7 @@
           </w:tcPr>
           <w:p>
             <w:r>
-              <w:t>Milestone 3/Milestone 4 operational readiness, structured telemetry, and failure alerts.</w:t>
+              <w:t>Milestone 3 operational readiness, structured telemetry, and failure alerts.</w:t>
             </w:r>
           </w:p>
         </w:tc>
@@ -6648,7 +7358,7 @@
           </w:tcPr>
           <w:p>
             <w:r>
-              <w:t>Complete inability to diagnose runtime faults or demonstrate operational readiness in Milestone 4.</w:t>
+              <w:t>Complete inability to diagnose runtime faults or demonstrate operational readiness in Milestone 3.</w:t>
             </w:r>
           </w:p>
         </w:tc>
@@ -6722,6 +7432,7 @@
           </w:tcPr>
           <w:p>
             <w:r>
+              <w:lastRenderedPageBreak/>
               <w:t>FEC-07</w:t>
             </w:r>
           </w:p>
@@ -6752,7 +7463,7 @@
           </w:tcPr>
           <w:p>
             <w:r>
-              <w:t>Milestone 3/Milestone 4 deployment, backup scripting, and database migration routines.</w:t>
+              <w:t>Deployment, backup scripting, and database migration routines.</w:t>
             </w:r>
           </w:p>
         </w:tc>
@@ -6778,9 +7489,402 @@
         </w:tc>
       </w:tr>
     </w:tbl>
+    <w:p>
+      <w:pPr>
+        <w:sectPr>
+          <w:pgSz w:w="16838" w:h="11906" w:orient="landscape"/>
+          <w:pgMar w:top="1440" w:right="1440" w:bottom="1440" w:left="1440" w:header="708" w:footer="708" w:gutter="0"/>
+          <w:cols w:space="708"/>
+          <w:docGrid w:linePitch="360"/>
+        </w:sectPr>
+      </w:pPr>
+    </w:p>
+    <w:p>
+      <w:pPr>
+        <w:pStyle w:val="Heading1"/>
+      </w:pPr>
+      <w:r>
+        <w:lastRenderedPageBreak/>
+        <w:t>Milestone 1 Baseline Review and Controlled Evolution</w:t>
+      </w:r>
+    </w:p>
+    <w:p>
+      <w:r>
+        <w:t>In this section, the approved Milestone 1 baseline is reviewed before Milestone decisions are added, identifying material clarifications, changed assumptions, and items Milestone 1 deliberately deferred for Milestone 2 evidence.</w:t>
+      </w:r>
+    </w:p>
+    <w:p>
+      <w:pPr>
+        <w:pStyle w:val="Heading2"/>
+      </w:pPr>
+      <w:r>
+        <w:t>Functional and non-functional requirements</w:t>
+      </w:r>
+    </w:p>
+    <w:p>
+      <w:pPr>
+        <w:pStyle w:val="Heading3"/>
+      </w:pPr>
+      <w:r>
+        <w:t>1. FR-011 &amp; NFR-002 - resolved overlap</w:t>
+      </w:r>
+    </w:p>
+    <w:p>
+      <w:r>
+        <w:t>Milestone 1's RTM review identified that FR-011 (the severity flag mechanic) and NFR-002 (High-severity requests visibly distinguished) described closely related territory. For Milestone 2, here is the formal resolve: </w:t>
+      </w:r>
+      <w:r>
+        <w:rPr>
+          <w:b/>
+          <w:bCs/>
+        </w:rPr>
+        <w:t>NFR-002 is retained as the quality rationale</w:t>
+      </w:r>
+      <w:r>
+        <w:t> (indicating why safety-critical visibility matters, which is tied to the original stakeholder conflict), and </w:t>
+      </w:r>
+      <w:r>
+        <w:rPr>
+          <w:b/>
+          <w:bCs/>
+        </w:rPr>
+        <w:t>FR-011 remains the sole carrier of the testable acceptance criteria</w:t>
+      </w:r>
+      <w:r>
+        <w:t> (the actual flagging mechanic). NFR-002 is updated to reference FR-011's AC rather than duplicating it. This is not a scope change - it is a traceability clarification, and both requirement IDs are preserved.</w:t>
+      </w:r>
+    </w:p>
+    <w:p>
+      <w:pPr>
+        <w:pStyle w:val="Heading3"/>
+      </w:pPr>
+      <w:r>
+        <w:t>2. FR-002 - tightened status-transition definition</w:t>
+      </w:r>
+    </w:p>
+    <w:p>
+      <w:r>
+        <w:t>Milestone 1 baselined FR-002 as "staff shall update request status through defined transitions" with the transition sequence (New -&gt; Assigned -&gt; In Progress -&gt; Resolved -&gt; Closed) stated narratively. For Milestone 2, ahead of implementing the Observer-based notification design (indicated in Assignment 2, the Design Problem 1), we formalise this as an explicit state-transition rule set - naming which transitions are valid and which are not (e.g. a "Closed" status cannot transition back to "New"). This clarification is required before the Factory/Observer design</w:t>
+      </w:r>
+      <w:r>
+        <w:t>,</w:t>
+      </w:r>
+      <w:r>
+        <w:t xml:space="preserve"> and the data/persistence transactional boundary can be implemented correctly. </w:t>
+      </w:r>
+      <w:r>
+        <w:rPr>
+          <w:b/>
+          <w:bCs/>
+        </w:rPr>
+        <w:t>FR-002's wording and ID remain unchanged; this is an implementation-level clarification, not a scope change.</w:t>
+      </w:r>
+    </w:p>
+    <w:p>
+      <w:pPr>
+        <w:pStyle w:val="Heading3"/>
+      </w:pPr>
+      <w:r>
+        <w:t>3. NFR-005 - deferred, remains provisional</w:t>
+      </w:r>
+    </w:p>
+    <w:p>
+      <w:r>
+        <w:t xml:space="preserve">Milestone 1 explicitly flagged NFR-005 (the 3-second list view load) as "indicative - refine once hosting is chosen". This remains open pending the Technology Stack </w:t>
+      </w:r>
+      <w:r>
+        <w:lastRenderedPageBreak/>
+        <w:t xml:space="preserve">decision (§5.5), where it will be confirmed or adjusted </w:t>
+      </w:r>
+      <w:r>
+        <w:t>against</w:t>
+      </w:r>
+      <w:r>
+        <w:t xml:space="preserve"> the actual chosen platform's realistic performance </w:t>
+      </w:r>
+      <w:r>
+        <w:t>characteristic</w:t>
+      </w:r>
+      <w:r>
+        <w:t>s</w:t>
+      </w:r>
+      <w:r>
+        <w:t>, and logged as a formal decision at that point.</w:t>
+      </w:r>
+    </w:p>
+    <w:p>
+      <w:pPr>
+        <w:pStyle w:val="Heading3"/>
+      </w:pPr>
+      <w:r>
+        <w:t>4. NFR-006 (Forward Engineering Consideration) - Milestone 2 verification due</w:t>
+      </w:r>
+    </w:p>
+    <w:p>
+      <w:r>
+        <w:t>Milestone 1 marked NFR-006 (single-complex-entity data association) acceptance criteria as "N/A - architectural constraint, verified at Milestone 2 design review", per Milestone 1's own RTM rule. This verification is satisfied in the Data &amp; Persistence Baseline section (§5.4), where the actual data model is shown to enforce this association.</w:t>
+      </w:r>
+    </w:p>
+    <w:p>
+      <w:pPr>
+        <w:pStyle w:val="Heading3"/>
+      </w:pPr>
+      <w:r>
+        <w:t>5. No other baselined requirement, scope item, or defended exclusion changes</w:t>
+      </w:r>
+    </w:p>
+    <w:p>
+      <w:r>
+        <w:t>The 11 FRs, 6 NFRs, and both Milestone 1 scope exclusions (levy/payment, multi-tenancy) remain as baselined. No new evidence has emerged that justifies revisiting them at this stage.</w:t>
+      </w:r>
+    </w:p>
+    <w:p>
+      <w:pPr>
+        <w:pStyle w:val="Heading1"/>
+      </w:pPr>
+      <w:r>
+        <w:t>ASRs and Quality Drivers</w:t>
+      </w:r>
+    </w:p>
+    <w:p>
+      <w:pPr>
+        <w:pStyle w:val="Heading2"/>
+      </w:pPr>
+      <w:r>
+        <w:t>Architecturally Significant Requirements (ASRs)</w:t>
+      </w:r>
+    </w:p>
+    <w:p>
+      <w:r>
+        <w:t xml:space="preserve">Reviewing the Milestone 1 Baseline, four requirements materially influence </w:t>
+      </w:r>
+      <w:proofErr w:type="spellStart"/>
+      <w:r>
+        <w:t>CivicConnect's</w:t>
+      </w:r>
+      <w:proofErr w:type="spellEnd"/>
+      <w:r>
+        <w:t xml:space="preserve"> architecture, data, and technology direction. These requirements are selected because it constrains a design decision, not merely because it is important in general.</w:t>
+      </w:r>
+    </w:p>
+    <w:p>
+      <w:pPr>
+        <w:pStyle w:val="Heading3"/>
+      </w:pPr>
+      <w:r>
+        <w:t>ASR-1: NFR-001 - Authenticated access to personal/unit data</w:t>
+      </w:r>
+    </w:p>
+    <w:p>
+      <w:r>
+        <w:rPr>
+          <w:b/>
+          <w:bCs/>
+        </w:rPr>
+        <w:t>Source:</w:t>
+      </w:r>
+      <w:r>
+        <w:t> Security constraint, tied to the resident and staff access conflict identified in Stakeholder Analysis (M1).</w:t>
+      </w:r>
+    </w:p>
+    <w:p>
+      <w:r>
+        <w:rPr>
+          <w:b/>
+          <w:bCs/>
+        </w:rPr>
+        <w:t>Why architecturally significant:</w:t>
+      </w:r>
+      <w:r>
+        <w:t xml:space="preserve"> This forces an early architectural commitment to identity management and role-based access control as a cross-cutting concern, not an </w:t>
+      </w:r>
+      <w:r>
+        <w:lastRenderedPageBreak/>
+        <w:t>afterthought bolted onto the individual endpoints. It directly constrains the Technology Stack decision (§5.5); any candidate stack must have mature, well-supported authentication tooling. The API/Integration decision (§5.7), since every endpoint touching request data must enforce this boundary.</w:t>
+      </w:r>
+    </w:p>
+    <w:p>
+      <w:r>
+        <w:rPr>
+          <w:b/>
+          <w:bCs/>
+        </w:rPr>
+        <w:t>Measurable expectation:</w:t>
+      </w:r>
+      <w:r>
+        <w:t> Unauthenticated requests to any endpoint exposing resident/unit data return a 401/403 response, verified by automated integration test.</w:t>
+      </w:r>
+    </w:p>
+    <w:p>
+      <w:pPr>
+        <w:pStyle w:val="Heading3"/>
+      </w:pPr>
+      <w:r>
+        <w:t>ASR-2: NFR-004 - Status history never silently overwritten</w:t>
+      </w:r>
+    </w:p>
+    <w:p>
+      <w:r>
+        <w:rPr>
+          <w:b/>
+          <w:bCs/>
+        </w:rPr>
+        <w:t>Source:</w:t>
+      </w:r>
+      <w:r>
+        <w:t> </w:t>
+      </w:r>
+      <w:proofErr w:type="gramStart"/>
+      <w:r>
+        <w:t>Accountability</w:t>
+      </w:r>
+      <w:proofErr w:type="gramEnd"/>
+      <w:r>
+        <w:t xml:space="preserve"> need; tied to Wonderpark Estates' body-corporate audit requirement (mentioned in Milestone 1 Problem Statement)</w:t>
+      </w:r>
+    </w:p>
+    <w:p>
+      <w:r>
+        <w:rPr>
+          <w:b/>
+          <w:bCs/>
+        </w:rPr>
+        <w:t>Why architecturally significant:</w:t>
+      </w:r>
+      <w:r>
+        <w:t xml:space="preserve"> This is the </w:t>
+      </w:r>
+      <w:r>
+        <w:t>single</w:t>
+      </w:r>
+      <w:r>
+        <w:t xml:space="preserve"> requirement driving the entire Data and Persistence Baseline decision (§5.4) - it rules out any design where a status update simply overwrites a </w:t>
+      </w:r>
+      <w:proofErr w:type="gramStart"/>
+      <w:r>
+        <w:t>field, and</w:t>
+      </w:r>
+      <w:proofErr w:type="gramEnd"/>
+      <w:r>
+        <w:t xml:space="preserve"> requires either an append-only history table or event-sourcing-style logging. It also justifies the transactional/OCC approach recommended in Assignment 2's Task 2 (Researching Persistence and Data-Integrity Decisions), since a partial write would violate this NFR directly</w:t>
+      </w:r>
+    </w:p>
+    <w:p>
+      <w:r>
+        <w:rPr>
+          <w:b/>
+          <w:bCs/>
+        </w:rPr>
+        <w:t>Measurable expectation:</w:t>
+      </w:r>
+      <w:r>
+        <w:t> A request's full status history remains queryable and unaltered after any subsequent status change.</w:t>
+      </w:r>
+    </w:p>
+    <w:p>
+      <w:pPr>
+        <w:pStyle w:val="Heading3"/>
+      </w:pPr>
+      <w:r>
+        <w:t>ASR-3: FR-011 / NFR-002 - Severity-based visual prioritisation</w:t>
+      </w:r>
+    </w:p>
+    <w:p>
+      <w:r>
+        <w:rPr>
+          <w:b/>
+          <w:bCs/>
+        </w:rPr>
+        <w:t>Source:</w:t>
+      </w:r>
+      <w:r>
+        <w:t> The resolved stakeholder conflict (residents want instant resolution vs. managing agent must prioritise safety-critical issues), which is now consolidated per §4.1's baseline review.</w:t>
+      </w:r>
+    </w:p>
+    <w:p>
+      <w:r>
+        <w:rPr>
+          <w:b/>
+          <w:bCs/>
+        </w:rPr>
+        <w:t>Why architecturally significant:</w:t>
+      </w:r>
+      <w:r>
+        <w:t> This drives a concrete design decision; the Observer pattern for notification/dashboard/audit-log decoupling, per Assignment 2's Task 1 (Establishing the Design Problem) and has UI/data implications - severity must be a first-class, queryable field, not a derived one, so it can be filtered and visually distinguished in the staf</w:t>
+      </w:r>
+      <w:r>
+        <w:t>f</w:t>
+      </w:r>
+      <w:r>
+        <w:t xml:space="preserve"> queue.</w:t>
+      </w:r>
+    </w:p>
+    <w:p>
+      <w:r>
+        <w:rPr>
+          <w:b/>
+          <w:bCs/>
+        </w:rPr>
+        <w:t>Measurable expectation:</w:t>
+      </w:r>
+      <w:r>
+        <w:t> High-severity requests are visually distinguished in the staff queue and correctly filterable.</w:t>
+      </w:r>
+    </w:p>
+    <w:p>
+      <w:pPr>
+        <w:pStyle w:val="Heading3"/>
+      </w:pPr>
+      <w:r>
+        <w:lastRenderedPageBreak/>
+        <w:t>ASR-4: NFR-005 — List-view load performance</w:t>
+      </w:r>
+    </w:p>
+    <w:p>
+      <w:r>
+        <w:rPr>
+          <w:b/>
+          <w:bCs/>
+        </w:rPr>
+        <w:t>Source:</w:t>
+      </w:r>
+      <w:r>
+        <w:t xml:space="preserve"> Quality constraint, currently </w:t>
+      </w:r>
+      <w:r>
+        <w:t>provisional</w:t>
+      </w:r>
+      <w:r>
+        <w:t xml:space="preserve"> per §4.1.</w:t>
+      </w:r>
+    </w:p>
+    <w:p>
+      <w:r>
+        <w:rPr>
+          <w:b/>
+          <w:bCs/>
+        </w:rPr>
+        <w:t>Why architecturally significant:</w:t>
+      </w:r>
+      <w:r>
+        <w:t> Even provisionally, this drives a preference toward efficient query patterns for the request-list view (e.g. avoiding query problems, appropriate indexing on status/severity/category) and will factor into the Technology Stack comparison (§5.5) once a concrete target is set against the chosen hosting platform.</w:t>
+      </w:r>
+    </w:p>
+    <w:p>
+      <w:r>
+        <w:rPr>
+          <w:b/>
+          <w:bCs/>
+        </w:rPr>
+        <w:t>Measurable expectation:</w:t>
+      </w:r>
+      <w:r>
+        <w:t> Currently indicative (list view loads within 3 seconds under normal load); to be confirmed against the actual selected platform in §5.5, at which point this ASRs expectation becomes final.</w:t>
+      </w:r>
+    </w:p>
     <w:p/>
     <w:sectPr>
-      <w:pgSz w:w="16838" w:h="11906" w:orient="landscape"/>
+      <w:pgSz w:w="11906" w:h="16838"/>
       <w:pgMar w:top="1440" w:right="1440" w:bottom="1440" w:left="1440" w:header="708" w:footer="708" w:gutter="0"/>
       <w:cols w:space="708"/>
       <w:docGrid w:linePitch="360"/>
@@ -7524,7 +8628,6 @@
     <w:next w:val="Normal"/>
     <w:link w:val="Heading3Char"/>
     <w:uiPriority w:val="9"/>
-    <w:semiHidden/>
     <w:unhideWhenUsed/>
     <w:qFormat/>
     <w:rsid w:val="00E03412"/>
@@ -7676,7 +8779,6 @@
   <w:style w:type="character" w:default="1" w:styleId="DefaultParagraphFont">
     <w:name w:val="Default Paragraph Font"/>
     <w:uiPriority w:val="1"/>
-    <w:semiHidden/>
     <w:unhideWhenUsed/>
   </w:style>
   <w:style w:type="table" w:default="1" w:styleId="TableNormal">
@@ -7731,7 +8833,6 @@
     <w:basedOn w:val="DefaultParagraphFont"/>
     <w:link w:val="Heading3"/>
     <w:uiPriority w:val="9"/>
-    <w:semiHidden/>
     <w:rsid w:val="00E03412"/>
     <w:rPr>
       <w:rFonts w:eastAsiaTheme="majorEastAsia" w:cstheme="majorBidi"/>
@@ -8073,6 +9174,30 @@
       <w:spacing w:after="0" w:line="240" w:lineRule="auto"/>
     </w:pPr>
   </w:style>
+  <w:style w:type="character" w:styleId="Strong">
+    <w:name w:val="Strong"/>
+    <w:basedOn w:val="DefaultParagraphFont"/>
+    <w:uiPriority w:val="22"/>
+    <w:qFormat/>
+    <w:rsid w:val="00806E6F"/>
+    <w:rPr>
+      <w:b/>
+      <w:bCs/>
+    </w:rPr>
+  </w:style>
+  <w:style w:type="character" w:styleId="HTMLCode">
+    <w:name w:val="HTML Code"/>
+    <w:basedOn w:val="DefaultParagraphFont"/>
+    <w:uiPriority w:val="99"/>
+    <w:semiHidden/>
+    <w:unhideWhenUsed/>
+    <w:rsid w:val="00806E6F"/>
+    <w:rPr>
+      <w:rFonts w:ascii="Courier New" w:eastAsia="Times New Roman" w:hAnsi="Courier New" w:cs="Courier New"/>
+      <w:sz w:val="20"/>
+      <w:szCs w:val="20"/>
+    </w:rPr>
+  </w:style>
 </w:styles>
 </file>
 

</xml_diff>

<commit_message>
Update PED v2.0 and AI register
This change updates the Project Engineering Document v2.0 (not yet final), refreshes the associated AI declaration PDF, and revises the AI register to record the consolidated PED v2.0 entry. It ensures the project documentation reflects the finalised PED version and keeps the AI usage record aligned with the updated document set.
</commit_message>
<xml_diff>
--- a/docs/Project Engineering Document v2.0.docx
+++ b/docs/Project Engineering Document v2.0.docx
@@ -3592,16 +3592,16 @@
     <w:tbl>
       <w:tblPr>
         <w:tblStyle w:val="TableGrid"/>
-        <w:tblW w:w="14350" w:type="dxa"/>
+        <w:tblW w:w="14492" w:type="dxa"/>
         <w:tblInd w:w="-289" w:type="dxa"/>
         <w:tblLayout w:type="fixed"/>
         <w:tblLook w:val="04A0" w:firstRow="1" w:lastRow="0" w:firstColumn="1" w:lastColumn="0" w:noHBand="0" w:noVBand="1"/>
       </w:tblPr>
       <w:tblGrid>
         <w:gridCol w:w="739"/>
-        <w:gridCol w:w="2517"/>
-        <w:gridCol w:w="1642"/>
-        <w:gridCol w:w="1760"/>
+        <w:gridCol w:w="1813"/>
+        <w:gridCol w:w="2552"/>
+        <w:gridCol w:w="1696"/>
         <w:gridCol w:w="1559"/>
         <w:gridCol w:w="1276"/>
         <w:gridCol w:w="1276"/>
@@ -3631,7 +3631,7 @@
         </w:tc>
         <w:tc>
           <w:tcPr>
-            <w:tcW w:w="2517" w:type="dxa"/>
+            <w:tcW w:w="1813" w:type="dxa"/>
           </w:tcPr>
           <w:p>
             <w:pPr>
@@ -3651,7 +3651,7 @@
         </w:tc>
         <w:tc>
           <w:tcPr>
-            <w:tcW w:w="1642" w:type="dxa"/>
+            <w:tcW w:w="2552" w:type="dxa"/>
           </w:tcPr>
           <w:p>
             <w:pPr>
@@ -3671,7 +3671,7 @@
         </w:tc>
         <w:tc>
           <w:tcPr>
-            <w:tcW w:w="1760" w:type="dxa"/>
+            <w:tcW w:w="1696" w:type="dxa"/>
           </w:tcPr>
           <w:p>
             <w:pPr>
@@ -3803,7 +3803,7 @@
         </w:tc>
         <w:tc>
           <w:tcPr>
-            <w:tcW w:w="2517" w:type="dxa"/>
+            <w:tcW w:w="1813" w:type="dxa"/>
           </w:tcPr>
           <w:p>
             <w:r>
@@ -3813,17 +3813,17 @@
         </w:tc>
         <w:tc>
           <w:tcPr>
-            <w:tcW w:w="1642" w:type="dxa"/>
-          </w:tcPr>
-          <w:p>
-            <w:r>
-              <w:t>Drafted</w:t>
-            </w:r>
-          </w:p>
-        </w:tc>
-        <w:tc>
-          <w:tcPr>
-            <w:tcW w:w="1760" w:type="dxa"/>
+            <w:tcW w:w="2552" w:type="dxa"/>
+          </w:tcPr>
+          <w:p>
+            <w:r>
+              <w:t>Request created with category, description, location, status "New", ref#, default severity "Low"</w:t>
+            </w:r>
+          </w:p>
+        </w:tc>
+        <w:tc>
+          <w:tcPr>
+            <w:tcW w:w="1696" w:type="dxa"/>
           </w:tcPr>
           <w:p>
             <w:r>
@@ -3867,7 +3867,7 @@
           </w:tcPr>
           <w:p>
             <w:r>
-              <w:t>-</w:t>
+              <w:t>ASR-1, ASR-3</w:t>
             </w:r>
           </w:p>
         </w:tc>
@@ -3903,7 +3903,7 @@
         </w:tc>
         <w:tc>
           <w:tcPr>
-            <w:tcW w:w="2517" w:type="dxa"/>
+            <w:tcW w:w="1813" w:type="dxa"/>
           </w:tcPr>
           <w:p>
             <w:r>
@@ -3913,17 +3913,17 @@
         </w:tc>
         <w:tc>
           <w:tcPr>
-            <w:tcW w:w="1642" w:type="dxa"/>
-          </w:tcPr>
-          <w:p>
-            <w:r>
-              <w:t>Drafted</w:t>
-            </w:r>
-          </w:p>
-        </w:tc>
-        <w:tc>
-          <w:tcPr>
-            <w:tcW w:w="1760" w:type="dxa"/>
+            <w:tcW w:w="2552" w:type="dxa"/>
+          </w:tcPr>
+          <w:p>
+            <w:r>
+              <w:t>Staff updates status through valid transitions; timestamp and actor recorded</w:t>
+            </w:r>
+          </w:p>
+        </w:tc>
+        <w:tc>
+          <w:tcPr>
+            <w:tcW w:w="1696" w:type="dxa"/>
           </w:tcPr>
           <w:p>
             <w:r>
@@ -3967,7 +3967,7 @@
           </w:tcPr>
           <w:p>
             <w:r>
-              <w:t>-</w:t>
+              <w:t>ASR-2</w:t>
             </w:r>
           </w:p>
         </w:tc>
@@ -3995,7 +3995,7 @@
         </w:tc>
         <w:tc>
           <w:tcPr>
-            <w:tcW w:w="2517" w:type="dxa"/>
+            <w:tcW w:w="1813" w:type="dxa"/>
           </w:tcPr>
           <w:p>
             <w:r>
@@ -4005,17 +4005,33 @@
         </w:tc>
         <w:tc>
           <w:tcPr>
-            <w:tcW w:w="1642" w:type="dxa"/>
-          </w:tcPr>
-          <w:p>
-            <w:r>
-              <w:t>Drafted</w:t>
-            </w:r>
-          </w:p>
-        </w:tc>
-        <w:tc>
-          <w:tcPr>
-            <w:tcW w:w="1760" w:type="dxa"/>
+            <w:tcW w:w="2552" w:type="dxa"/>
+          </w:tcPr>
+          <w:p>
+            <w:r>
+              <w:t xml:space="preserve">Logged-in resident </w:t>
+            </w:r>
+            <w:proofErr w:type="gramStart"/>
+            <w:r>
+              <w:t>see</w:t>
+            </w:r>
+            <w:proofErr w:type="gramEnd"/>
+            <w:r>
+              <w:t xml:space="preserve"> all their submitted requests with </w:t>
+            </w:r>
+            <w:proofErr w:type="gramStart"/>
+            <w:r>
+              <w:t>current status</w:t>
+            </w:r>
+            <w:proofErr w:type="gramEnd"/>
+            <w:r>
+              <w:t xml:space="preserve"> and a chronological history of changes</w:t>
+            </w:r>
+          </w:p>
+        </w:tc>
+        <w:tc>
+          <w:tcPr>
+            <w:tcW w:w="1696" w:type="dxa"/>
           </w:tcPr>
           <w:p>
             <w:r>
@@ -4081,13 +4097,14 @@
           </w:tcPr>
           <w:p>
             <w:r>
+              <w:lastRenderedPageBreak/>
               <w:t>FR-004</w:t>
             </w:r>
           </w:p>
         </w:tc>
         <w:tc>
           <w:tcPr>
-            <w:tcW w:w="2517" w:type="dxa"/>
+            <w:tcW w:w="1813" w:type="dxa"/>
           </w:tcPr>
           <w:p>
             <w:r>
@@ -4097,17 +4114,17 @@
         </w:tc>
         <w:tc>
           <w:tcPr>
-            <w:tcW w:w="1642" w:type="dxa"/>
-          </w:tcPr>
-          <w:p>
-            <w:r>
-              <w:t>Drafted</w:t>
-            </w:r>
-          </w:p>
-        </w:tc>
-        <w:tc>
-          <w:tcPr>
-            <w:tcW w:w="1760" w:type="dxa"/>
+            <w:tcW w:w="2552" w:type="dxa"/>
+          </w:tcPr>
+          <w:p>
+            <w:r>
+              <w:t>Resident notified in-app when request status changes</w:t>
+            </w:r>
+          </w:p>
+        </w:tc>
+        <w:tc>
+          <w:tcPr>
+            <w:tcW w:w="1696" w:type="dxa"/>
           </w:tcPr>
           <w:p>
             <w:r>
@@ -4151,7 +4168,7 @@
           </w:tcPr>
           <w:p>
             <w:r>
-              <w:t>-</w:t>
+              <w:t>ASR-3</w:t>
             </w:r>
           </w:p>
         </w:tc>
@@ -4187,7 +4204,7 @@
         </w:tc>
         <w:tc>
           <w:tcPr>
-            <w:tcW w:w="2517" w:type="dxa"/>
+            <w:tcW w:w="1813" w:type="dxa"/>
           </w:tcPr>
           <w:p>
             <w:r>
@@ -4197,17 +4214,17 @@
         </w:tc>
         <w:tc>
           <w:tcPr>
-            <w:tcW w:w="1642" w:type="dxa"/>
-          </w:tcPr>
-          <w:p>
-            <w:r>
-              <w:t>Drafted</w:t>
-            </w:r>
-          </w:p>
-        </w:tc>
-        <w:tc>
-          <w:tcPr>
-            <w:tcW w:w="1760" w:type="dxa"/>
+            <w:tcW w:w="2552" w:type="dxa"/>
+          </w:tcPr>
+          <w:p>
+            <w:r>
+              <w:t>"Given a staff member viewing the request queue only views matching requests are displayed based on filter applied</w:t>
+            </w:r>
+          </w:p>
+        </w:tc>
+        <w:tc>
+          <w:tcPr>
+            <w:tcW w:w="1696" w:type="dxa"/>
           </w:tcPr>
           <w:p>
             <w:r>
@@ -4273,14 +4290,13 @@
           </w:tcPr>
           <w:p>
             <w:r>
-              <w:lastRenderedPageBreak/>
               <w:t>FR-006</w:t>
             </w:r>
           </w:p>
         </w:tc>
         <w:tc>
           <w:tcPr>
-            <w:tcW w:w="2517" w:type="dxa"/>
+            <w:tcW w:w="1813" w:type="dxa"/>
           </w:tcPr>
           <w:p>
             <w:r>
@@ -4290,17 +4306,17 @@
         </w:tc>
         <w:tc>
           <w:tcPr>
-            <w:tcW w:w="1642" w:type="dxa"/>
-          </w:tcPr>
-          <w:p>
-            <w:r>
-              <w:t>Drafted</w:t>
-            </w:r>
-          </w:p>
-        </w:tc>
-        <w:tc>
-          <w:tcPr>
-            <w:tcW w:w="1760" w:type="dxa"/>
+            <w:tcW w:w="2552" w:type="dxa"/>
+          </w:tcPr>
+          <w:p>
+            <w:r>
+              <w:t>An unassigned request updates when selected "Accept" by an authorised staff member, being removed from unassigned queue</w:t>
+            </w:r>
+          </w:p>
+        </w:tc>
+        <w:tc>
+          <w:tcPr>
+            <w:tcW w:w="1696" w:type="dxa"/>
           </w:tcPr>
           <w:p>
             <w:r>
@@ -4372,7 +4388,7 @@
         </w:tc>
         <w:tc>
           <w:tcPr>
-            <w:tcW w:w="2517" w:type="dxa"/>
+            <w:tcW w:w="1813" w:type="dxa"/>
           </w:tcPr>
           <w:p>
             <w:r>
@@ -4382,20 +4398,25 @@
         </w:tc>
         <w:tc>
           <w:tcPr>
-            <w:tcW w:w="1642" w:type="dxa"/>
-          </w:tcPr>
-          <w:p>
-            <w:r>
-              <w:t>Drafted</w:t>
-            </w:r>
-          </w:p>
-        </w:tc>
-        <w:tc>
-          <w:tcPr>
-            <w:tcW w:w="1760" w:type="dxa"/>
-          </w:tcPr>
-          <w:p>
-            <w:r>
+            <w:tcW w:w="2552" w:type="dxa"/>
+          </w:tcPr>
+          <w:p>
+            <w:r>
+              <w:t xml:space="preserve">An assigned request appends with visible history with timestamp and author </w:t>
+            </w:r>
+            <w:r>
+              <w:lastRenderedPageBreak/>
+              <w:t>when commented or given an action note</w:t>
+            </w:r>
+          </w:p>
+        </w:tc>
+        <w:tc>
+          <w:tcPr>
+            <w:tcW w:w="1696" w:type="dxa"/>
+          </w:tcPr>
+          <w:p>
+            <w:r>
+              <w:lastRenderedPageBreak/>
               <w:t>-</w:t>
             </w:r>
           </w:p>
@@ -4464,7 +4485,7 @@
         </w:tc>
         <w:tc>
           <w:tcPr>
-            <w:tcW w:w="2517" w:type="dxa"/>
+            <w:tcW w:w="1813" w:type="dxa"/>
           </w:tcPr>
           <w:p>
             <w:r>
@@ -4474,17 +4495,17 @@
         </w:tc>
         <w:tc>
           <w:tcPr>
-            <w:tcW w:w="1642" w:type="dxa"/>
-          </w:tcPr>
-          <w:p>
-            <w:r>
-              <w:t>Drafted</w:t>
-            </w:r>
-          </w:p>
-        </w:tc>
-        <w:tc>
-          <w:tcPr>
-            <w:tcW w:w="1760" w:type="dxa"/>
+            <w:tcW w:w="2552" w:type="dxa"/>
+          </w:tcPr>
+          <w:p>
+            <w:r>
+              <w:t>Dashboard shows open/overdue/resolved/closed counts</w:t>
+            </w:r>
+          </w:p>
+        </w:tc>
+        <w:tc>
+          <w:tcPr>
+            <w:tcW w:w="1696" w:type="dxa"/>
           </w:tcPr>
           <w:p>
             <w:r>
@@ -4528,7 +4549,7 @@
           </w:tcPr>
           <w:p>
             <w:r>
-              <w:t>-</w:t>
+              <w:t>ASR-3, ASR-4</w:t>
             </w:r>
           </w:p>
         </w:tc>
@@ -4564,7 +4585,7 @@
         </w:tc>
         <w:tc>
           <w:tcPr>
-            <w:tcW w:w="2517" w:type="dxa"/>
+            <w:tcW w:w="1813" w:type="dxa"/>
           </w:tcPr>
           <w:p>
             <w:r>
@@ -4574,17 +4595,17 @@
         </w:tc>
         <w:tc>
           <w:tcPr>
-            <w:tcW w:w="1642" w:type="dxa"/>
-          </w:tcPr>
-          <w:p>
-            <w:r>
-              <w:t>Drafted</w:t>
-            </w:r>
-          </w:p>
-        </w:tc>
-        <w:tc>
-          <w:tcPr>
-            <w:tcW w:w="1760" w:type="dxa"/>
+            <w:tcW w:w="2552" w:type="dxa"/>
+          </w:tcPr>
+          <w:p>
+            <w:r>
+              <w:t>Requests display in filtered groups when selected "Group by category" or "Group by severity"</w:t>
+            </w:r>
+          </w:p>
+        </w:tc>
+        <w:tc>
+          <w:tcPr>
+            <w:tcW w:w="1696" w:type="dxa"/>
           </w:tcPr>
           <w:p>
             <w:r>
@@ -4656,7 +4677,7 @@
         </w:tc>
         <w:tc>
           <w:tcPr>
-            <w:tcW w:w="2517" w:type="dxa"/>
+            <w:tcW w:w="1813" w:type="dxa"/>
           </w:tcPr>
           <w:p>
             <w:r>
@@ -4666,17 +4687,17 @@
         </w:tc>
         <w:tc>
           <w:tcPr>
-            <w:tcW w:w="1642" w:type="dxa"/>
-          </w:tcPr>
-          <w:p>
-            <w:r>
-              <w:t>Drafted</w:t>
-            </w:r>
-          </w:p>
-        </w:tc>
-        <w:tc>
-          <w:tcPr>
-            <w:tcW w:w="1760" w:type="dxa"/>
+            <w:tcW w:w="2552" w:type="dxa"/>
+          </w:tcPr>
+          <w:p>
+            <w:r>
+              <w:t>A unique reference number is assigned on a new request submission</w:t>
+            </w:r>
+          </w:p>
+        </w:tc>
+        <w:tc>
+          <w:tcPr>
+            <w:tcW w:w="1696" w:type="dxa"/>
           </w:tcPr>
           <w:p>
             <w:r>
@@ -4748,7 +4769,7 @@
         </w:tc>
         <w:tc>
           <w:tcPr>
-            <w:tcW w:w="2517" w:type="dxa"/>
+            <w:tcW w:w="1813" w:type="dxa"/>
           </w:tcPr>
           <w:p>
             <w:r>
@@ -4758,17 +4779,17 @@
         </w:tc>
         <w:tc>
           <w:tcPr>
-            <w:tcW w:w="1642" w:type="dxa"/>
-          </w:tcPr>
-          <w:p>
-            <w:r>
-              <w:t>Drafted</w:t>
-            </w:r>
-          </w:p>
-        </w:tc>
-        <w:tc>
-          <w:tcPr>
-            <w:tcW w:w="1760" w:type="dxa"/>
+            <w:tcW w:w="2552" w:type="dxa"/>
+          </w:tcPr>
+          <w:p>
+            <w:r>
+              <w:t>Severity flag (Low/Medium/High) set/viewed; High flagged visibly</w:t>
+            </w:r>
+          </w:p>
+        </w:tc>
+        <w:tc>
+          <w:tcPr>
+            <w:tcW w:w="1696" w:type="dxa"/>
           </w:tcPr>
           <w:p>
             <w:r>
@@ -4834,13 +4855,14 @@
           </w:tcPr>
           <w:p>
             <w:r>
+              <w:lastRenderedPageBreak/>
               <w:t>NFR-001</w:t>
             </w:r>
           </w:p>
         </w:tc>
         <w:tc>
           <w:tcPr>
-            <w:tcW w:w="2517" w:type="dxa"/>
+            <w:tcW w:w="1813" w:type="dxa"/>
           </w:tcPr>
           <w:p>
             <w:r>
@@ -4850,17 +4872,17 @@
         </w:tc>
         <w:tc>
           <w:tcPr>
-            <w:tcW w:w="1642" w:type="dxa"/>
-          </w:tcPr>
-          <w:p>
-            <w:r>
-              <w:t>Drafted</w:t>
-            </w:r>
-          </w:p>
-        </w:tc>
-        <w:tc>
-          <w:tcPr>
-            <w:tcW w:w="1760" w:type="dxa"/>
+            <w:tcW w:w="2552" w:type="dxa"/>
+          </w:tcPr>
+          <w:p>
+            <w:r>
+              <w:t>System denies access to unauthenticated users</w:t>
+            </w:r>
+          </w:p>
+        </w:tc>
+        <w:tc>
+          <w:tcPr>
+            <w:tcW w:w="1696" w:type="dxa"/>
           </w:tcPr>
           <w:p>
             <w:r>
@@ -4932,7 +4954,7 @@
         </w:tc>
         <w:tc>
           <w:tcPr>
-            <w:tcW w:w="2517" w:type="dxa"/>
+            <w:tcW w:w="1813" w:type="dxa"/>
           </w:tcPr>
           <w:p>
             <w:r>
@@ -4942,7 +4964,7 @@
         </w:tc>
         <w:tc>
           <w:tcPr>
-            <w:tcW w:w="1642" w:type="dxa"/>
+            <w:tcW w:w="2552" w:type="dxa"/>
           </w:tcPr>
           <w:p>
             <w:r>
@@ -4952,7 +4974,7 @@
         </w:tc>
         <w:tc>
           <w:tcPr>
-            <w:tcW w:w="1760" w:type="dxa"/>
+            <w:tcW w:w="1696" w:type="dxa"/>
           </w:tcPr>
           <w:p>
             <w:r>
@@ -5018,14 +5040,13 @@
           </w:tcPr>
           <w:p>
             <w:r>
-              <w:lastRenderedPageBreak/>
               <w:t>NFR-003</w:t>
             </w:r>
           </w:p>
         </w:tc>
         <w:tc>
           <w:tcPr>
-            <w:tcW w:w="2517" w:type="dxa"/>
+            <w:tcW w:w="1813" w:type="dxa"/>
           </w:tcPr>
           <w:p>
             <w:r>
@@ -5035,17 +5056,17 @@
         </w:tc>
         <w:tc>
           <w:tcPr>
-            <w:tcW w:w="1642" w:type="dxa"/>
-          </w:tcPr>
-          <w:p>
-            <w:r>
-              <w:t>Drafted</w:t>
-            </w:r>
-          </w:p>
-        </w:tc>
-        <w:tc>
-          <w:tcPr>
-            <w:tcW w:w="1760" w:type="dxa"/>
+            <w:tcW w:w="2552" w:type="dxa"/>
+          </w:tcPr>
+          <w:p>
+            <w:r>
+              <w:t>First-time users are given 3-minute usability test</w:t>
+            </w:r>
+          </w:p>
+        </w:tc>
+        <w:tc>
+          <w:tcPr>
+            <w:tcW w:w="1696" w:type="dxa"/>
           </w:tcPr>
           <w:p>
             <w:r>
@@ -5117,7 +5138,7 @@
         </w:tc>
         <w:tc>
           <w:tcPr>
-            <w:tcW w:w="2517" w:type="dxa"/>
+            <w:tcW w:w="1813" w:type="dxa"/>
           </w:tcPr>
           <w:p>
             <w:proofErr w:type="gramStart"/>
@@ -5132,17 +5153,17 @@
         </w:tc>
         <w:tc>
           <w:tcPr>
-            <w:tcW w:w="1642" w:type="dxa"/>
-          </w:tcPr>
-          <w:p>
-            <w:r>
-              <w:t>Drafted</w:t>
-            </w:r>
-          </w:p>
-        </w:tc>
-        <w:tc>
-          <w:tcPr>
-            <w:tcW w:w="1760" w:type="dxa"/>
+            <w:tcW w:w="2552" w:type="dxa"/>
+          </w:tcPr>
+          <w:p>
+            <w:r>
+              <w:t>Status changes never silently overwritten; history preserved</w:t>
+            </w:r>
+          </w:p>
+        </w:tc>
+        <w:tc>
+          <w:tcPr>
+            <w:tcW w:w="1696" w:type="dxa"/>
           </w:tcPr>
           <w:p>
             <w:r>
@@ -5222,7 +5243,7 @@
         </w:tc>
         <w:tc>
           <w:tcPr>
-            <w:tcW w:w="2517" w:type="dxa"/>
+            <w:tcW w:w="1813" w:type="dxa"/>
           </w:tcPr>
           <w:p>
             <w:r>
@@ -5232,17 +5253,17 @@
         </w:tc>
         <w:tc>
           <w:tcPr>
-            <w:tcW w:w="1642" w:type="dxa"/>
-          </w:tcPr>
-          <w:p>
-            <w:r>
-              <w:t>Drafted</w:t>
-            </w:r>
-          </w:p>
-        </w:tc>
-        <w:tc>
-          <w:tcPr>
-            <w:tcW w:w="1760" w:type="dxa"/>
+            <w:tcW w:w="2552" w:type="dxa"/>
+          </w:tcPr>
+          <w:p>
+            <w:r>
+              <w:t>Request list page renders within 3 seconds in navigation</w:t>
+            </w:r>
+          </w:p>
+        </w:tc>
+        <w:tc>
+          <w:tcPr>
+            <w:tcW w:w="1696" w:type="dxa"/>
           </w:tcPr>
           <w:p>
             <w:r>
@@ -5308,13 +5329,14 @@
           </w:tcPr>
           <w:p>
             <w:r>
+              <w:lastRenderedPageBreak/>
               <w:t>NFR-006</w:t>
             </w:r>
           </w:p>
         </w:tc>
         <w:tc>
           <w:tcPr>
-            <w:tcW w:w="2517" w:type="dxa"/>
+            <w:tcW w:w="1813" w:type="dxa"/>
           </w:tcPr>
           <w:p>
             <w:r>
@@ -5324,7 +5346,7 @@
         </w:tc>
         <w:tc>
           <w:tcPr>
-            <w:tcW w:w="1642" w:type="dxa"/>
+            <w:tcW w:w="2552" w:type="dxa"/>
           </w:tcPr>
           <w:p>
             <w:r>
@@ -5334,17 +5356,68 @@
         </w:tc>
         <w:tc>
           <w:tcPr>
-            <w:tcW w:w="1760" w:type="dxa"/>
-          </w:tcPr>
-          <w:p>
-            <w:r>
+            <w:tcW w:w="1696" w:type="dxa"/>
+          </w:tcPr>
+          <w:p>
+            <w:r>
+              <w:t xml:space="preserve">Data model shall associate all requests/users with a single </w:t>
+            </w:r>
+            <w:proofErr w:type="spellStart"/>
+            <w:r>
+              <w:t>complex_id</w:t>
+            </w:r>
+            <w:proofErr w:type="spellEnd"/>
+            <w:r>
+              <w:t xml:space="preserve"> entity, enforcing single-complex scope at the database level, to avoid architectural rework if multi-tenant support is added later. Verified at Milestone 2 </w:t>
+            </w:r>
+            <w:r>
+              <w:lastRenderedPageBreak/>
+              <w:t xml:space="preserve">design review: all requests and user records include </w:t>
+            </w:r>
+            <w:proofErr w:type="spellStart"/>
+            <w:r>
+              <w:t>complex_id</w:t>
+            </w:r>
+            <w:proofErr w:type="spellEnd"/>
+            <w:r>
+              <w:t xml:space="preserve"> foreign key; no query or mutation operates outside complex scope.</w:t>
+            </w:r>
+          </w:p>
+        </w:tc>
+        <w:tc>
+          <w:tcPr>
+            <w:tcW w:w="1559" w:type="dxa"/>
+          </w:tcPr>
+          <w:p>
+            <w:r>
+              <w:lastRenderedPageBreak/>
               <w:t>-</w:t>
             </w:r>
           </w:p>
         </w:tc>
         <w:tc>
           <w:tcPr>
-            <w:tcW w:w="1559" w:type="dxa"/>
+            <w:tcW w:w="1276" w:type="dxa"/>
+          </w:tcPr>
+          <w:p>
+            <w:r>
+              <w:t>Draft</w:t>
+            </w:r>
+          </w:p>
+        </w:tc>
+        <w:tc>
+          <w:tcPr>
+            <w:tcW w:w="1276" w:type="dxa"/>
+          </w:tcPr>
+          <w:p>
+            <w:r>
+              <w:t>Pending — see §5.4</w:t>
+            </w:r>
+          </w:p>
+        </w:tc>
+        <w:tc>
+          <w:tcPr>
+            <w:tcW w:w="1276" w:type="dxa"/>
           </w:tcPr>
           <w:p>
             <w:r>
@@ -5354,27 +5427,273 @@
         </w:tc>
         <w:tc>
           <w:tcPr>
-            <w:tcW w:w="1276" w:type="dxa"/>
-          </w:tcPr>
-          <w:p>
-            <w:r>
-              <w:t>Draft</w:t>
-            </w:r>
-          </w:p>
-        </w:tc>
-        <w:tc>
-          <w:tcPr>
-            <w:tcW w:w="1276" w:type="dxa"/>
-          </w:tcPr>
-          <w:p>
-            <w:r>
-              <w:t>Pending — see §5.4</w:t>
-            </w:r>
-          </w:p>
-        </w:tc>
-        <w:tc>
-          <w:tcPr>
-            <w:tcW w:w="1276" w:type="dxa"/>
+            <w:tcW w:w="2305" w:type="dxa"/>
+          </w:tcPr>
+          <w:p>
+            <w:r>
+              <w:t>Persistence (data model)</w:t>
+            </w:r>
+          </w:p>
+        </w:tc>
+      </w:tr>
+    </w:tbl>
+    <w:p>
+      <w:bookmarkStart w:id="9" w:name="_Toc239883849"/>
+    </w:p>
+    <w:p>
+      <w:pPr>
+        <w:spacing w:line="278" w:lineRule="auto"/>
+        <w:rPr>
+          <w:rFonts w:asciiTheme="majorHAnsi" w:eastAsiaTheme="majorEastAsia" w:hAnsiTheme="majorHAnsi" w:cstheme="majorBidi"/>
+          <w:color w:val="0F4761" w:themeColor="accent1" w:themeShade="BF"/>
+          <w:sz w:val="40"/>
+          <w:szCs w:val="40"/>
+        </w:rPr>
+      </w:pPr>
+      <w:r>
+        <w:br w:type="page"/>
+      </w:r>
+    </w:p>
+    <w:p>
+      <w:pPr>
+        <w:pStyle w:val="Heading1"/>
+      </w:pPr>
+      <w:r>
+        <w:lastRenderedPageBreak/>
+        <w:t>Requirements Traceability Matrix (RTM)</w:t>
+      </w:r>
+      <w:r>
+        <w:t xml:space="preserve"> contd.</w:t>
+      </w:r>
+    </w:p>
+    <w:tbl>
+      <w:tblPr>
+        <w:tblStyle w:val="TableGrid"/>
+        <w:tblW w:w="13948" w:type="dxa"/>
+        <w:tblLook w:val="04A0" w:firstRow="1" w:lastRow="0" w:firstColumn="1" w:lastColumn="0" w:noHBand="0" w:noVBand="1"/>
+      </w:tblPr>
+      <w:tblGrid>
+        <w:gridCol w:w="739"/>
+        <w:gridCol w:w="3674"/>
+        <w:gridCol w:w="7767"/>
+        <w:gridCol w:w="1768"/>
+      </w:tblGrid>
+      <w:tr>
+        <w:tc>
+          <w:tcPr>
+            <w:tcW w:w="739" w:type="dxa"/>
+          </w:tcPr>
+          <w:p>
+            <w:r>
+              <w:rPr>
+                <w:b/>
+                <w:bCs/>
+              </w:rPr>
+              <w:t>Req ID</w:t>
+            </w:r>
+          </w:p>
+        </w:tc>
+        <w:tc>
+          <w:tcPr>
+            <w:tcW w:w="6253" w:type="dxa"/>
+          </w:tcPr>
+          <w:p>
+            <w:pPr>
+              <w:rPr>
+                <w:b/>
+                <w:bCs/>
+              </w:rPr>
+            </w:pPr>
+            <w:r>
+              <w:rPr>
+                <w:b/>
+                <w:bCs/>
+              </w:rPr>
+              <w:t>Design Pattern/Decision</w:t>
+            </w:r>
+          </w:p>
+        </w:tc>
+        <w:tc>
+          <w:tcPr>
+            <w:tcW w:w="3478" w:type="dxa"/>
+          </w:tcPr>
+          <w:p>
+            <w:pPr>
+              <w:rPr>
+                <w:b/>
+                <w:bCs/>
+              </w:rPr>
+            </w:pPr>
+            <w:r>
+              <w:rPr>
+                <w:b/>
+                <w:bCs/>
+              </w:rPr>
+              <w:t>Implementation evidence</w:t>
+            </w:r>
+          </w:p>
+        </w:tc>
+        <w:tc>
+          <w:tcPr>
+            <w:tcW w:w="3478" w:type="dxa"/>
+          </w:tcPr>
+          <w:p>
+            <w:pPr>
+              <w:rPr>
+                <w:b/>
+                <w:bCs/>
+              </w:rPr>
+            </w:pPr>
+            <w:r>
+              <w:rPr>
+                <w:b/>
+                <w:bCs/>
+              </w:rPr>
+              <w:t>Status</w:t>
+            </w:r>
+          </w:p>
+        </w:tc>
+      </w:tr>
+      <w:tr>
+        <w:tc>
+          <w:tcPr>
+            <w:tcW w:w="739" w:type="dxa"/>
+          </w:tcPr>
+          <w:p>
+            <w:r>
+              <w:t>FR-001</w:t>
+            </w:r>
+          </w:p>
+        </w:tc>
+        <w:tc>
+          <w:tcPr>
+            <w:tcW w:w="6253" w:type="dxa"/>
+          </w:tcPr>
+          <w:p>
+            <w:r>
+              <w:t>Factory Pattern (</w:t>
+            </w:r>
+            <w:proofErr w:type="spellStart"/>
+            <w:r>
+              <w:t>RequestFactory.create</w:t>
+            </w:r>
+            <w:proofErr w:type="spellEnd"/>
+            <w:r>
+              <w:t>)</w:t>
+            </w:r>
+          </w:p>
+        </w:tc>
+        <w:tc>
+          <w:tcPr>
+            <w:tcW w:w="3478" w:type="dxa"/>
+          </w:tcPr>
+          <w:p>
+            <w:r>
+              <w:t>/</w:t>
+            </w:r>
+            <w:proofErr w:type="spellStart"/>
+            <w:r>
+              <w:t>src</w:t>
+            </w:r>
+            <w:proofErr w:type="spellEnd"/>
+            <w:r>
+              <w:t>/services/RequestFactory.js, /</w:t>
+            </w:r>
+            <w:proofErr w:type="spellStart"/>
+            <w:r>
+              <w:t>src</w:t>
+            </w:r>
+            <w:proofErr w:type="spellEnd"/>
+            <w:r>
+              <w:t>/services/</w:t>
+            </w:r>
+            <w:proofErr w:type="spellStart"/>
+            <w:r>
+              <w:t>requestTypes</w:t>
+            </w:r>
+            <w:proofErr w:type="spellEnd"/>
+            <w:r>
+              <w:t>/*.</w:t>
+            </w:r>
+            <w:proofErr w:type="spellStart"/>
+            <w:r>
+              <w:t>js</w:t>
+            </w:r>
+            <w:proofErr w:type="spellEnd"/>
+          </w:p>
+        </w:tc>
+        <w:tc>
+          <w:tcPr>
+            <w:tcW w:w="3478" w:type="dxa"/>
+          </w:tcPr>
+          <w:p>
+            <w:r>
+              <w:t>In Development</w:t>
+            </w:r>
+          </w:p>
+        </w:tc>
+      </w:tr>
+      <w:tr>
+        <w:tc>
+          <w:tcPr>
+            <w:tcW w:w="739" w:type="dxa"/>
+          </w:tcPr>
+          <w:p>
+            <w:r>
+              <w:t>FR-002</w:t>
+            </w:r>
+          </w:p>
+        </w:tc>
+        <w:tc>
+          <w:tcPr>
+            <w:tcW w:w="6253" w:type="dxa"/>
+          </w:tcPr>
+          <w:p>
+            <w:r>
+              <w:t>Observer Pattern (status change notifies) + ACID transaction</w:t>
+            </w:r>
+          </w:p>
+        </w:tc>
+        <w:tc>
+          <w:tcPr>
+            <w:tcW w:w="3478" w:type="dxa"/>
+          </w:tcPr>
+          <w:p>
+            <w:proofErr w:type="gramStart"/>
+            <w:r>
+              <w:t>/src/services/RequestService.updateStatus(</w:t>
+            </w:r>
+            <w:proofErr w:type="gramEnd"/>
+            <w:r>
+              <w:t>), /src/services/observers/*.js</w:t>
+            </w:r>
+          </w:p>
+        </w:tc>
+        <w:tc>
+          <w:tcPr>
+            <w:tcW w:w="3478" w:type="dxa"/>
+          </w:tcPr>
+          <w:p>
+            <w:r>
+              <w:t>In Development</w:t>
+            </w:r>
+          </w:p>
+        </w:tc>
+      </w:tr>
+      <w:tr>
+        <w:tc>
+          <w:tcPr>
+            <w:tcW w:w="739" w:type="dxa"/>
+          </w:tcPr>
+          <w:p>
+            <w:r>
+              <w:t>FR-003</w:t>
+            </w:r>
+          </w:p>
+        </w:tc>
+        <w:tc>
+          <w:tcPr>
+            <w:tcW w:w="6253" w:type="dxa"/>
           </w:tcPr>
           <w:p>
             <w:r>
@@ -5384,11 +5703,674 @@
         </w:tc>
         <w:tc>
           <w:tcPr>
-            <w:tcW w:w="2305" w:type="dxa"/>
-          </w:tcPr>
-          <w:p>
-            <w:r>
-              <w:t>Persistence (data model)</w:t>
+            <w:tcW w:w="3478" w:type="dxa"/>
+          </w:tcPr>
+          <w:p>
+            <w:r>
+              <w:t>-</w:t>
+            </w:r>
+          </w:p>
+        </w:tc>
+        <w:tc>
+          <w:tcPr>
+            <w:tcW w:w="3478" w:type="dxa"/>
+          </w:tcPr>
+          <w:p>
+            <w:r>
+              <w:t>-</w:t>
+            </w:r>
+          </w:p>
+        </w:tc>
+      </w:tr>
+      <w:tr>
+        <w:tc>
+          <w:tcPr>
+            <w:tcW w:w="739" w:type="dxa"/>
+          </w:tcPr>
+          <w:p>
+            <w:r>
+              <w:t>FR-004</w:t>
+            </w:r>
+          </w:p>
+        </w:tc>
+        <w:tc>
+          <w:tcPr>
+            <w:tcW w:w="6253" w:type="dxa"/>
+          </w:tcPr>
+          <w:p>
+            <w:r>
+              <w:t>Observer (</w:t>
+            </w:r>
+            <w:proofErr w:type="spellStart"/>
+            <w:r>
+              <w:t>ResidentNotificationObserver</w:t>
+            </w:r>
+            <w:proofErr w:type="spellEnd"/>
+            <w:r>
+              <w:t>)</w:t>
+            </w:r>
+          </w:p>
+        </w:tc>
+        <w:tc>
+          <w:tcPr>
+            <w:tcW w:w="3478" w:type="dxa"/>
+          </w:tcPr>
+          <w:p>
+            <w:r>
+              <w:t>/</w:t>
+            </w:r>
+            <w:proofErr w:type="spellStart"/>
+            <w:r>
+              <w:t>src</w:t>
+            </w:r>
+            <w:proofErr w:type="spellEnd"/>
+            <w:r>
+              <w:t>/services/observers/ResidentNotificationObserver.js</w:t>
+            </w:r>
+          </w:p>
+        </w:tc>
+        <w:tc>
+          <w:tcPr>
+            <w:tcW w:w="3478" w:type="dxa"/>
+          </w:tcPr>
+          <w:p>
+            <w:r>
+              <w:t>Planned</w:t>
+            </w:r>
+          </w:p>
+        </w:tc>
+      </w:tr>
+      <w:tr>
+        <w:tc>
+          <w:tcPr>
+            <w:tcW w:w="739" w:type="dxa"/>
+          </w:tcPr>
+          <w:p>
+            <w:r>
+              <w:t>FR-005</w:t>
+            </w:r>
+          </w:p>
+        </w:tc>
+        <w:tc>
+          <w:tcPr>
+            <w:tcW w:w="6253" w:type="dxa"/>
+          </w:tcPr>
+          <w:p>
+            <w:r>
+              <w:t>-</w:t>
+            </w:r>
+          </w:p>
+        </w:tc>
+        <w:tc>
+          <w:tcPr>
+            <w:tcW w:w="3478" w:type="dxa"/>
+          </w:tcPr>
+          <w:p>
+            <w:r>
+              <w:t>-</w:t>
+            </w:r>
+          </w:p>
+        </w:tc>
+        <w:tc>
+          <w:tcPr>
+            <w:tcW w:w="3478" w:type="dxa"/>
+          </w:tcPr>
+          <w:p>
+            <w:r>
+              <w:t>-</w:t>
+            </w:r>
+          </w:p>
+        </w:tc>
+      </w:tr>
+      <w:tr>
+        <w:tc>
+          <w:tcPr>
+            <w:tcW w:w="739" w:type="dxa"/>
+          </w:tcPr>
+          <w:p>
+            <w:r>
+              <w:t>FR-006</w:t>
+            </w:r>
+          </w:p>
+        </w:tc>
+        <w:tc>
+          <w:tcPr>
+            <w:tcW w:w="6253" w:type="dxa"/>
+          </w:tcPr>
+          <w:p>
+            <w:r>
+              <w:t>-</w:t>
+            </w:r>
+          </w:p>
+        </w:tc>
+        <w:tc>
+          <w:tcPr>
+            <w:tcW w:w="3478" w:type="dxa"/>
+          </w:tcPr>
+          <w:p>
+            <w:r>
+              <w:t>-</w:t>
+            </w:r>
+          </w:p>
+        </w:tc>
+        <w:tc>
+          <w:tcPr>
+            <w:tcW w:w="3478" w:type="dxa"/>
+          </w:tcPr>
+          <w:p>
+            <w:r>
+              <w:t>-</w:t>
+            </w:r>
+          </w:p>
+        </w:tc>
+      </w:tr>
+      <w:tr>
+        <w:tc>
+          <w:tcPr>
+            <w:tcW w:w="739" w:type="dxa"/>
+          </w:tcPr>
+          <w:p>
+            <w:r>
+              <w:t>FR-007</w:t>
+            </w:r>
+          </w:p>
+        </w:tc>
+        <w:tc>
+          <w:tcPr>
+            <w:tcW w:w="6253" w:type="dxa"/>
+          </w:tcPr>
+          <w:p>
+            <w:r>
+              <w:t>-</w:t>
+            </w:r>
+          </w:p>
+        </w:tc>
+        <w:tc>
+          <w:tcPr>
+            <w:tcW w:w="3478" w:type="dxa"/>
+          </w:tcPr>
+          <w:p>
+            <w:r>
+              <w:t>-</w:t>
+            </w:r>
+          </w:p>
+        </w:tc>
+        <w:tc>
+          <w:tcPr>
+            <w:tcW w:w="3478" w:type="dxa"/>
+          </w:tcPr>
+          <w:p>
+            <w:r>
+              <w:t>-</w:t>
+            </w:r>
+          </w:p>
+        </w:tc>
+      </w:tr>
+      <w:tr>
+        <w:tc>
+          <w:tcPr>
+            <w:tcW w:w="739" w:type="dxa"/>
+          </w:tcPr>
+          <w:p>
+            <w:r>
+              <w:t>FR-008</w:t>
+            </w:r>
+          </w:p>
+        </w:tc>
+        <w:tc>
+          <w:tcPr>
+            <w:tcW w:w="6253" w:type="dxa"/>
+          </w:tcPr>
+          <w:p>
+            <w:r>
+              <w:t>Observer (</w:t>
+            </w:r>
+            <w:proofErr w:type="spellStart"/>
+            <w:r>
+              <w:t>DashboardCountsObserver</w:t>
+            </w:r>
+            <w:proofErr w:type="spellEnd"/>
+            <w:r>
+              <w:t>)</w:t>
+            </w:r>
+          </w:p>
+        </w:tc>
+        <w:tc>
+          <w:tcPr>
+            <w:tcW w:w="3478" w:type="dxa"/>
+          </w:tcPr>
+          <w:p>
+            <w:r>
+              <w:t>/</w:t>
+            </w:r>
+            <w:proofErr w:type="spellStart"/>
+            <w:r>
+              <w:t>src</w:t>
+            </w:r>
+            <w:proofErr w:type="spellEnd"/>
+            <w:r>
+              <w:t>/services/observers/DashboardCountsObserver.js</w:t>
+            </w:r>
+          </w:p>
+        </w:tc>
+        <w:tc>
+          <w:tcPr>
+            <w:tcW w:w="3478" w:type="dxa"/>
+          </w:tcPr>
+          <w:p>
+            <w:r>
+              <w:t>Planned</w:t>
+            </w:r>
+          </w:p>
+        </w:tc>
+      </w:tr>
+      <w:tr>
+        <w:tc>
+          <w:tcPr>
+            <w:tcW w:w="739" w:type="dxa"/>
+          </w:tcPr>
+          <w:p>
+            <w:r>
+              <w:lastRenderedPageBreak/>
+              <w:t>FR-009</w:t>
+            </w:r>
+          </w:p>
+        </w:tc>
+        <w:tc>
+          <w:tcPr>
+            <w:tcW w:w="6253" w:type="dxa"/>
+          </w:tcPr>
+          <w:p>
+            <w:r>
+              <w:t>-</w:t>
+            </w:r>
+          </w:p>
+        </w:tc>
+        <w:tc>
+          <w:tcPr>
+            <w:tcW w:w="3478" w:type="dxa"/>
+          </w:tcPr>
+          <w:p>
+            <w:r>
+              <w:t>-</w:t>
+            </w:r>
+          </w:p>
+        </w:tc>
+        <w:tc>
+          <w:tcPr>
+            <w:tcW w:w="3478" w:type="dxa"/>
+          </w:tcPr>
+          <w:p>
+            <w:r>
+              <w:t>-</w:t>
+            </w:r>
+          </w:p>
+        </w:tc>
+      </w:tr>
+      <w:tr>
+        <w:tc>
+          <w:tcPr>
+            <w:tcW w:w="739" w:type="dxa"/>
+          </w:tcPr>
+          <w:p>
+            <w:r>
+              <w:t>FR-010</w:t>
+            </w:r>
+          </w:p>
+        </w:tc>
+        <w:tc>
+          <w:tcPr>
+            <w:tcW w:w="6253" w:type="dxa"/>
+          </w:tcPr>
+          <w:p>
+            <w:r>
+              <w:t>-</w:t>
+            </w:r>
+          </w:p>
+        </w:tc>
+        <w:tc>
+          <w:tcPr>
+            <w:tcW w:w="3478" w:type="dxa"/>
+          </w:tcPr>
+          <w:p>
+            <w:r>
+              <w:t>-</w:t>
+            </w:r>
+          </w:p>
+        </w:tc>
+        <w:tc>
+          <w:tcPr>
+            <w:tcW w:w="3478" w:type="dxa"/>
+          </w:tcPr>
+          <w:p>
+            <w:r>
+              <w:t>-</w:t>
+            </w:r>
+          </w:p>
+        </w:tc>
+      </w:tr>
+      <w:tr>
+        <w:tc>
+          <w:tcPr>
+            <w:tcW w:w="739" w:type="dxa"/>
+          </w:tcPr>
+          <w:p>
+            <w:r>
+              <w:t>FR-011</w:t>
+            </w:r>
+          </w:p>
+        </w:tc>
+        <w:tc>
+          <w:tcPr>
+            <w:tcW w:w="6253" w:type="dxa"/>
+          </w:tcPr>
+          <w:p>
+            <w:r>
+              <w:t>Factory Pattern (default severity in base Request)</w:t>
+            </w:r>
+          </w:p>
+        </w:tc>
+        <w:tc>
+          <w:tcPr>
+            <w:tcW w:w="3478" w:type="dxa"/>
+          </w:tcPr>
+          <w:p>
+            <w:r>
+              <w:t>/</w:t>
+            </w:r>
+            <w:proofErr w:type="spellStart"/>
+            <w:r>
+              <w:t>src</w:t>
+            </w:r>
+            <w:proofErr w:type="spellEnd"/>
+            <w:r>
+              <w:t>/services/</w:t>
+            </w:r>
+            <w:proofErr w:type="spellStart"/>
+            <w:r>
+              <w:t>requestTypes</w:t>
+            </w:r>
+            <w:proofErr w:type="spellEnd"/>
+            <w:r>
+              <w:t>/Request.js, Factory applies default</w:t>
+            </w:r>
+          </w:p>
+        </w:tc>
+        <w:tc>
+          <w:tcPr>
+            <w:tcW w:w="3478" w:type="dxa"/>
+          </w:tcPr>
+          <w:p>
+            <w:r>
+              <w:t>In Development</w:t>
+            </w:r>
+          </w:p>
+        </w:tc>
+      </w:tr>
+      <w:tr>
+        <w:tc>
+          <w:tcPr>
+            <w:tcW w:w="739" w:type="dxa"/>
+          </w:tcPr>
+          <w:p>
+            <w:r>
+              <w:t>NFR-001</w:t>
+            </w:r>
+          </w:p>
+        </w:tc>
+        <w:tc>
+          <w:tcPr>
+            <w:tcW w:w="6253" w:type="dxa"/>
+          </w:tcPr>
+          <w:p>
+            <w:r>
+              <w:t>-</w:t>
+            </w:r>
+          </w:p>
+        </w:tc>
+        <w:tc>
+          <w:tcPr>
+            <w:tcW w:w="3478" w:type="dxa"/>
+          </w:tcPr>
+          <w:p>
+            <w:r>
+              <w:t>-</w:t>
+            </w:r>
+          </w:p>
+        </w:tc>
+        <w:tc>
+          <w:tcPr>
+            <w:tcW w:w="3478" w:type="dxa"/>
+          </w:tcPr>
+          <w:p>
+            <w:r>
+              <w:t>-</w:t>
+            </w:r>
+          </w:p>
+        </w:tc>
+      </w:tr>
+      <w:tr>
+        <w:tc>
+          <w:tcPr>
+            <w:tcW w:w="739" w:type="dxa"/>
+          </w:tcPr>
+          <w:p>
+            <w:r>
+              <w:t>NFR-002</w:t>
+            </w:r>
+          </w:p>
+        </w:tc>
+        <w:tc>
+          <w:tcPr>
+            <w:tcW w:w="6253" w:type="dxa"/>
+          </w:tcPr>
+          <w:p>
+            <w:r>
+              <w:t>-</w:t>
+            </w:r>
+          </w:p>
+        </w:tc>
+        <w:tc>
+          <w:tcPr>
+            <w:tcW w:w="3478" w:type="dxa"/>
+          </w:tcPr>
+          <w:p>
+            <w:r>
+              <w:t>-</w:t>
+            </w:r>
+          </w:p>
+        </w:tc>
+        <w:tc>
+          <w:tcPr>
+            <w:tcW w:w="3478" w:type="dxa"/>
+          </w:tcPr>
+          <w:p>
+            <w:r>
+              <w:t>-</w:t>
+            </w:r>
+          </w:p>
+        </w:tc>
+      </w:tr>
+      <w:tr>
+        <w:tc>
+          <w:tcPr>
+            <w:tcW w:w="739" w:type="dxa"/>
+          </w:tcPr>
+          <w:p>
+            <w:r>
+              <w:t>NFR-003</w:t>
+            </w:r>
+          </w:p>
+        </w:tc>
+        <w:tc>
+          <w:tcPr>
+            <w:tcW w:w="6253" w:type="dxa"/>
+          </w:tcPr>
+          <w:p>
+            <w:r>
+              <w:t>-</w:t>
+            </w:r>
+          </w:p>
+        </w:tc>
+        <w:tc>
+          <w:tcPr>
+            <w:tcW w:w="3478" w:type="dxa"/>
+          </w:tcPr>
+          <w:p>
+            <w:r>
+              <w:t>-</w:t>
+            </w:r>
+          </w:p>
+        </w:tc>
+        <w:tc>
+          <w:tcPr>
+            <w:tcW w:w="3478" w:type="dxa"/>
+          </w:tcPr>
+          <w:p>
+            <w:r>
+              <w:t>-</w:t>
+            </w:r>
+          </w:p>
+        </w:tc>
+      </w:tr>
+      <w:tr>
+        <w:tc>
+          <w:tcPr>
+            <w:tcW w:w="739" w:type="dxa"/>
+          </w:tcPr>
+          <w:p>
+            <w:r>
+              <w:t>NFR-004</w:t>
+            </w:r>
+          </w:p>
+        </w:tc>
+        <w:tc>
+          <w:tcPr>
+            <w:tcW w:w="6253" w:type="dxa"/>
+          </w:tcPr>
+          <w:p>
+            <w:r>
+              <w:t>Observer (</w:t>
+            </w:r>
+            <w:proofErr w:type="spellStart"/>
+            <w:r>
+              <w:t>AuditHistoryObserver</w:t>
+            </w:r>
+            <w:proofErr w:type="spellEnd"/>
+            <w:r>
+              <w:t>) + ACID transaction</w:t>
+            </w:r>
+          </w:p>
+        </w:tc>
+        <w:tc>
+          <w:tcPr>
+            <w:tcW w:w="3478" w:type="dxa"/>
+          </w:tcPr>
+          <w:p>
+            <w:r>
+              <w:t>/</w:t>
+            </w:r>
+            <w:proofErr w:type="spellStart"/>
+            <w:r>
+              <w:t>src</w:t>
+            </w:r>
+            <w:proofErr w:type="spellEnd"/>
+            <w:r>
+              <w:t>/services/observers/AuditHistoryObserver.js, ADR-DATA-001</w:t>
+            </w:r>
+          </w:p>
+        </w:tc>
+        <w:tc>
+          <w:tcPr>
+            <w:tcW w:w="3478" w:type="dxa"/>
+          </w:tcPr>
+          <w:p>
+            <w:r>
+              <w:t>In Development</w:t>
+            </w:r>
+          </w:p>
+        </w:tc>
+      </w:tr>
+      <w:tr>
+        <w:tc>
+          <w:tcPr>
+            <w:tcW w:w="739" w:type="dxa"/>
+          </w:tcPr>
+          <w:p>
+            <w:r>
+              <w:t>NFR-005</w:t>
+            </w:r>
+          </w:p>
+        </w:tc>
+        <w:tc>
+          <w:tcPr>
+            <w:tcW w:w="6253" w:type="dxa"/>
+          </w:tcPr>
+          <w:p>
+            <w:r>
+              <w:t>-</w:t>
+            </w:r>
+          </w:p>
+        </w:tc>
+        <w:tc>
+          <w:tcPr>
+            <w:tcW w:w="3478" w:type="dxa"/>
+          </w:tcPr>
+          <w:p>
+            <w:r>
+              <w:t>-</w:t>
+            </w:r>
+          </w:p>
+        </w:tc>
+        <w:tc>
+          <w:tcPr>
+            <w:tcW w:w="3478" w:type="dxa"/>
+          </w:tcPr>
+          <w:p>
+            <w:r>
+              <w:t>-</w:t>
+            </w:r>
+          </w:p>
+        </w:tc>
+      </w:tr>
+      <w:tr>
+        <w:tc>
+          <w:tcPr>
+            <w:tcW w:w="739" w:type="dxa"/>
+          </w:tcPr>
+          <w:p>
+            <w:r>
+              <w:t>NFR-006</w:t>
+            </w:r>
+          </w:p>
+        </w:tc>
+        <w:tc>
+          <w:tcPr>
+            <w:tcW w:w="6253" w:type="dxa"/>
+          </w:tcPr>
+          <w:p>
+            <w:r>
+              <w:t>-</w:t>
+            </w:r>
+          </w:p>
+        </w:tc>
+        <w:tc>
+          <w:tcPr>
+            <w:tcW w:w="3478" w:type="dxa"/>
+          </w:tcPr>
+          <w:p>
+            <w:r>
+              <w:t>-</w:t>
+            </w:r>
+          </w:p>
+        </w:tc>
+        <w:tc>
+          <w:tcPr>
+            <w:tcW w:w="3478" w:type="dxa"/>
+          </w:tcPr>
+          <w:p>
+            <w:r>
+              <w:t>-</w:t>
             </w:r>
           </w:p>
         </w:tc>
@@ -5403,7 +6385,6 @@
           <w:docGrid w:linePitch="360"/>
         </w:sectPr>
       </w:pPr>
-      <w:bookmarkStart w:id="9" w:name="_Toc239883849"/>
     </w:p>
     <w:p>
       <w:pPr>
@@ -5643,7 +6624,6 @@
           </w:tcPr>
           <w:p>
             <w:r>
-              <w:lastRenderedPageBreak/>
               <w:t>Scope</w:t>
             </w:r>
           </w:p>
@@ -7594,16 +8574,7 @@
       </w:r>
       <w:r>
         <w:lastRenderedPageBreak/>
-        <w:t xml:space="preserve">decision (§5.5), where it will be confirmed or adjusted </w:t>
-      </w:r>
-      <w:r>
-        <w:t>against</w:t>
-      </w:r>
-      <w:r>
-        <w:t xml:space="preserve"> the actual chosen platform's realistic performance </w:t>
-      </w:r>
-      <w:r>
-        <w:t>characteristic</w:t>
+        <w:t>decision (§5.5), where it will be confirmed or adjusted against the actual chosen platform's realistic performance characteristic</w:t>
       </w:r>
       <w:r>
         <w:t>s</w:t>
@@ -7752,13 +8723,7 @@
         <w:t>Why architecturally significant:</w:t>
       </w:r>
       <w:r>
-        <w:t xml:space="preserve"> This is the </w:t>
-      </w:r>
-      <w:r>
-        <w:t>single</w:t>
-      </w:r>
-      <w:r>
-        <w:t xml:space="preserve"> requirement driving the entire Data and Persistence Baseline decision (§5.4) - it rules out any design where a status update simply overwrites a </w:t>
+        <w:t xml:space="preserve"> This is the single requirement driving the entire Data and Persistence Baseline decision (§5.4) - it rules out any design where a status update simply overwrites a </w:t>
       </w:r>
       <w:proofErr w:type="gramStart"/>
       <w:r>
@@ -7849,13 +8814,7 @@
         <w:t>Source:</w:t>
       </w:r>
       <w:r>
-        <w:t xml:space="preserve"> Quality constraint, currently </w:t>
-      </w:r>
-      <w:r>
-        <w:t>provisional</w:t>
-      </w:r>
-      <w:r>
-        <w:t xml:space="preserve"> per §4.1.</w:t>
+        <w:t> Quality constraint, currently provisional per §4.1.</w:t>
       </w:r>
     </w:p>
     <w:p>

</xml_diff>